<commit_message>
Sprint 01 Business Understanding (CDM-01) underway, project methodology complete
</commit_message>
<xml_diff>
--- a/crisp-dm/aeroq-crisp-dm.docx
+++ b/crisp-dm/aeroq-crisp-dm.docx
@@ -32,13 +32,8 @@
       <w:pPr>
         <w:pStyle w:val="Title"/>
       </w:pPr>
-      <w:proofErr w:type="spellStart"/>
-      <w:r>
-        <w:t>Aeroq</w:t>
-      </w:r>
-      <w:proofErr w:type="spellEnd"/>
-      <w:r>
-        <w:t>: CRISP-DM Process Documen</w:t>
+      <w:r>
+        <w:t>Aeroq: CRISP-DM Process Documen</w:t>
       </w:r>
       <w:r>
         <w:t>t</w:t>
@@ -88,6 +83,7 @@
         <w:rPr>
           <w:b/>
           <w:bCs/>
+          <w:noProof/>
           <w:sz w:val="44"/>
           <w:szCs w:val="44"/>
           <w:lang w:val="en-GB"/>
@@ -3568,6 +3564,9 @@
         <w:t>Background</w:t>
       </w:r>
       <w:bookmarkEnd w:id="6"/>
+      <w:r>
+        <w:t xml:space="preserve"> </w:t>
+      </w:r>
     </w:p>
     <w:p/>
     <w:p>
@@ -3575,7 +3574,10 @@
         <w:pStyle w:val="Heading4"/>
       </w:pPr>
       <w:r>
-        <w:t>Project overview (from proposal)</w:t>
+        <w:t xml:space="preserve">Project </w:t>
+      </w:r>
+      <w:r>
+        <w:t>Proposal</w:t>
       </w:r>
     </w:p>
     <w:p>
@@ -3619,155 +3621,788 @@
       </w:r>
     </w:p>
     <w:p/>
-    <w:p>
-      <w:pPr>
-        <w:spacing w:after="160" w:line="278" w:lineRule="auto"/>
+    <w:p/>
+    <w:p/>
+    <w:p/>
+    <w:p>
+      <w:pPr>
+        <w:pStyle w:val="Heading4"/>
+      </w:pPr>
+      <w:r>
+        <w:lastRenderedPageBreak/>
+        <w:t>Industry Overview</w:t>
+      </w:r>
+    </w:p>
+    <w:p>
+      <w:r>
+        <w:t xml:space="preserve">The consumer flight delay prediction market was first exploited by </w:t>
+      </w:r>
+      <w:proofErr w:type="spellStart"/>
+      <w:r>
+        <w:t>FlightCaster</w:t>
+      </w:r>
+      <w:proofErr w:type="spellEnd"/>
+      <w:r>
+        <w:t xml:space="preserve"> </w:t>
+      </w:r>
+      <w:r>
+        <w:t xml:space="preserve">in 2009 </w:t>
+      </w:r>
+      <w:r>
+        <w:t xml:space="preserve">and has continually evolved since. Smartphones, cloud computing, the proliferation of IoT in aviation, and accessible machine learning algorithms all </w:t>
+      </w:r>
+      <w:r>
+        <w:t>forced platform</w:t>
+      </w:r>
+      <w:r>
+        <w:t xml:space="preserve">s to adapt or </w:t>
+      </w:r>
+      <w:r>
+        <w:t>die</w:t>
+      </w:r>
+      <w:r>
+        <w:t>.</w:t>
+      </w:r>
+      <w:r>
+        <w:t xml:space="preserve"> </w:t>
+      </w:r>
+    </w:p>
+    <w:p/>
+    <w:p>
+      <w:pPr>
+        <w:pStyle w:val="Heading5"/>
+      </w:pPr>
+      <w:r>
+        <w:t>Flightly</w:t>
+      </w:r>
+    </w:p>
+    <w:p>
+      <w:r>
+        <w:t xml:space="preserve">Launched on 19/08/2019 by a team of three developers, </w:t>
+      </w:r>
+      <w:proofErr w:type="spellStart"/>
+      <w:r>
+        <w:t>Flightly</w:t>
+      </w:r>
+      <w:proofErr w:type="spellEnd"/>
+      <w:r>
+        <w:t xml:space="preserve"> has since emerged among the market leaders and</w:t>
+      </w:r>
+      <w:r>
+        <w:t xml:space="preserve"> was awarded the </w:t>
+      </w:r>
+      <w:r>
+        <w:t xml:space="preserve">2023 </w:t>
+      </w:r>
+      <w:r>
+        <w:t>Apple Design Award</w:t>
+      </w:r>
+      <w:r>
+        <w:t xml:space="preserve">. </w:t>
+      </w:r>
+      <w:r>
+        <w:t>The company reports millions of active users</w:t>
+      </w:r>
+      <w:r>
+        <w:t xml:space="preserve"> across the world and holds </w:t>
+      </w:r>
+      <w:r>
+        <w:t>a 4.7 out of 5 average rating on the Irish iOS App Store (as of 10/10/2026).</w:t>
+      </w:r>
+      <w:r>
+        <w:t xml:space="preserve"> </w:t>
+      </w:r>
+      <w:proofErr w:type="spellStart"/>
+      <w:r>
+        <w:t>Flightly</w:t>
+      </w:r>
+      <w:proofErr w:type="spellEnd"/>
+      <w:r>
+        <w:t xml:space="preserve"> differentiators include the incorporation of airport taxi times, the use of ground and proximity radar data in their predictions, flight gate predictions, sharing of data with friends/family, and a user-friendly summary of their delay prediction, something they call </w:t>
+      </w:r>
+      <w:r>
+        <w:rPr>
+          <w:i/>
+          <w:iCs/>
+        </w:rPr>
+        <w:t>Airport Intelligence</w:t>
+      </w:r>
+      <w:r>
+        <w:t>.</w:t>
+      </w:r>
+    </w:p>
+    <w:p/>
+    <w:p>
+      <w:hyperlink r:id="rId9" w:history="1">
+        <w:r>
+          <w:rPr>
+            <w:rStyle w:val="Hyperlink"/>
+          </w:rPr>
+          <w:t>https://startupintros.com/orgs/flightcaster</w:t>
+        </w:r>
+      </w:hyperlink>
+    </w:p>
+    <w:p>
+      <w:r>
+        <w:t>https://mercury.com/blog/flighty-app-case-study</w:t>
+      </w:r>
+    </w:p>
+    <w:p>
+      <w:hyperlink r:id="rId10" w:history="1">
+        <w:r>
+          <w:rPr>
+            <w:rStyle w:val="Hyperlink"/>
+          </w:rPr>
+          <w:t>https://flighty.com/about</w:t>
+        </w:r>
+      </w:hyperlink>
+    </w:p>
+    <w:p>
+      <w:hyperlink r:id="rId11" w:history="1">
+        <w:r>
+          <w:rPr>
+            <w:rStyle w:val="Hyperlink"/>
+          </w:rPr>
+          <w:t>https://apps.apple.com/us/app/flighty-live-flight-tracker/id1358823008</w:t>
+        </w:r>
+      </w:hyperlink>
+    </w:p>
+    <w:p/>
+    <w:p>
+      <w:pPr>
+        <w:pStyle w:val="Heading5"/>
+      </w:pPr>
+      <w:r>
+        <w:t>TripIt</w:t>
+      </w:r>
+    </w:p>
+    <w:p>
+      <w:pPr>
+        <w:rPr>
+          <w:lang w:val="en-GB"/>
+        </w:rPr>
+      </w:pPr>
+      <w:r>
+        <w:rPr>
+          <w:lang w:val="en-GB"/>
+        </w:rPr>
+        <w:t>TripIt</w:t>
+      </w:r>
+      <w:r>
+        <w:rPr>
+          <w:lang w:val="en-GB"/>
+        </w:rPr>
+        <w:t xml:space="preserve">, founded in </w:t>
+      </w:r>
+      <w:r>
+        <w:rPr>
+          <w:lang w:val="en-GB"/>
+        </w:rPr>
+        <w:t>2006</w:t>
+      </w:r>
+      <w:r>
+        <w:rPr>
+          <w:lang w:val="en-GB"/>
+        </w:rPr>
+        <w:t xml:space="preserve"> and now owned by SAP</w:t>
+      </w:r>
+      <w:r>
+        <w:rPr>
+          <w:lang w:val="en-GB"/>
+        </w:rPr>
+        <w:t>, represents a stalwart in th</w:t>
+      </w:r>
+      <w:r>
+        <w:rPr>
+          <w:lang w:val="en-GB"/>
+        </w:rPr>
+        <w:t xml:space="preserve">e travel itinerary </w:t>
+      </w:r>
+      <w:r>
+        <w:rPr>
+          <w:lang w:val="en-GB"/>
+        </w:rPr>
+        <w:t xml:space="preserve">industry that has ventured into flight delay predictions. </w:t>
+      </w:r>
+      <w:r>
+        <w:rPr>
+          <w:lang w:val="en-GB"/>
+        </w:rPr>
+        <w:t>TripIt</w:t>
+      </w:r>
+      <w:r>
+        <w:rPr>
+          <w:i/>
+          <w:iCs/>
+          <w:lang w:val="en-GB"/>
+        </w:rPr>
+        <w:t xml:space="preserve"> </w:t>
+      </w:r>
+      <w:r>
+        <w:rPr>
+          <w:lang w:val="en-GB"/>
+        </w:rPr>
+        <w:t xml:space="preserve">reports </w:t>
+      </w:r>
+      <w:r>
+        <w:rPr>
+          <w:lang w:val="en-GB"/>
+        </w:rPr>
+        <w:t xml:space="preserve">that over </w:t>
+      </w:r>
+      <w:r>
+        <w:rPr>
+          <w:lang w:val="en-GB"/>
+        </w:rPr>
+        <w:t xml:space="preserve">22 million </w:t>
+      </w:r>
+      <w:r>
+        <w:rPr>
+          <w:lang w:val="en-GB"/>
+        </w:rPr>
+        <w:t>total users have logged more than 2.9 billion travel days</w:t>
+      </w:r>
+      <w:r>
+        <w:rPr>
+          <w:lang w:val="en-GB"/>
+        </w:rPr>
+        <w:t xml:space="preserve"> in the last 20 years</w:t>
+      </w:r>
+      <w:r>
+        <w:rPr>
+          <w:lang w:val="en-GB"/>
+        </w:rPr>
+        <w:t>.</w:t>
+      </w:r>
+      <w:r>
+        <w:rPr>
+          <w:lang w:val="en-GB"/>
+        </w:rPr>
+        <w:t xml:space="preserve"> </w:t>
+      </w:r>
+      <w:r>
+        <w:rPr>
+          <w:lang w:val="en-GB"/>
+        </w:rPr>
+        <w:t>TripIt</w:t>
+      </w:r>
+      <w:r>
+        <w:rPr>
+          <w:lang w:val="en-GB"/>
+        </w:rPr>
+        <w:t xml:space="preserve"> differentiates itself through a “</w:t>
+      </w:r>
+      <w:r>
+        <w:rPr>
+          <w:lang w:val="en-GB"/>
+        </w:rPr>
+        <w:t>whole</w:t>
+      </w:r>
+      <w:r>
+        <w:rPr>
+          <w:lang w:val="en-GB"/>
+        </w:rPr>
+        <w:t xml:space="preserve"> trip</w:t>
+      </w:r>
+      <w:r>
+        <w:rPr>
+          <w:lang w:val="en-GB"/>
+        </w:rPr>
+        <w:t xml:space="preserve">” approach, </w:t>
+      </w:r>
+      <w:r>
+        <w:rPr>
+          <w:lang w:val="en-GB"/>
+        </w:rPr>
+        <w:t>utilising</w:t>
+      </w:r>
+      <w:r>
+        <w:rPr>
+          <w:lang w:val="en-GB"/>
+        </w:rPr>
+        <w:t xml:space="preserve"> live airline status data, </w:t>
+      </w:r>
+      <w:r>
+        <w:rPr>
+          <w:lang w:val="en-GB"/>
+        </w:rPr>
+        <w:t>Riskline</w:t>
+      </w:r>
+      <w:r>
+        <w:rPr>
+          <w:lang w:val="en-GB"/>
+        </w:rPr>
+        <w:t xml:space="preserve"> </w:t>
+      </w:r>
+      <w:r>
+        <w:rPr>
+          <w:lang w:val="en-GB"/>
+        </w:rPr>
+        <w:t>travel</w:t>
+      </w:r>
+      <w:r>
+        <w:rPr>
+          <w:lang w:val="en-GB"/>
+        </w:rPr>
+        <w:t xml:space="preserve"> intelligence, and </w:t>
+      </w:r>
+      <w:r>
+        <w:rPr>
+          <w:lang w:val="en-GB"/>
+        </w:rPr>
+        <w:t>IBM</w:t>
+      </w:r>
+      <w:r>
+        <w:rPr>
+          <w:lang w:val="en-GB"/>
+        </w:rPr>
+        <w:t xml:space="preserve"> weather forecasts</w:t>
+      </w:r>
+      <w:r>
+        <w:rPr>
+          <w:lang w:val="en-GB"/>
+        </w:rPr>
+        <w:t>, via</w:t>
+      </w:r>
+      <w:r>
+        <w:rPr>
+          <w:lang w:val="en-GB"/>
+        </w:rPr>
+        <w:t xml:space="preserve"> </w:t>
+      </w:r>
+      <w:r>
+        <w:rPr>
+          <w:lang w:val="en-GB"/>
+        </w:rPr>
+        <w:t>The Weather Channel</w:t>
+      </w:r>
+      <w:r>
+        <w:rPr>
+          <w:lang w:val="en-GB"/>
+        </w:rPr>
+        <w:t>,</w:t>
+      </w:r>
+      <w:r>
+        <w:rPr>
+          <w:lang w:val="en-GB"/>
+        </w:rPr>
+        <w:t xml:space="preserve"> </w:t>
+      </w:r>
+      <w:r>
+        <w:rPr>
+          <w:lang w:val="en-GB"/>
+        </w:rPr>
+        <w:t>to alert user</w:t>
+      </w:r>
+      <w:r>
+        <w:rPr>
+          <w:lang w:val="en-GB"/>
+        </w:rPr>
+        <w:t>s</w:t>
+      </w:r>
+      <w:r>
+        <w:rPr>
+          <w:lang w:val="en-GB"/>
+        </w:rPr>
+        <w:t>.</w:t>
+      </w:r>
+    </w:p>
+    <w:p>
+      <w:pPr>
+        <w:rPr>
+          <w:lang w:val="en-GB"/>
+        </w:rPr>
+      </w:pPr>
+    </w:p>
+    <w:p>
+      <w:pPr>
+        <w:rPr>
+          <w:lang w:val="en-GB"/>
+        </w:rPr>
+      </w:pPr>
+      <w:hyperlink r:id="rId12" w:history="1">
+        <w:r>
+          <w:rPr>
+            <w:rStyle w:val="Hyperlink"/>
+            <w:lang w:val="en-GB"/>
+          </w:rPr>
+          <w:t>https://www.tripit.com/web/tripit-20th-anniversary</w:t>
+        </w:r>
+      </w:hyperlink>
+    </w:p>
+    <w:p>
+      <w:pPr>
+        <w:rPr>
+          <w:lang w:val="en-GB"/>
+        </w:rPr>
+      </w:pPr>
+      <w:r>
+        <w:rPr>
+          <w:lang w:val="en-GB"/>
+        </w:rPr>
+        <w:t>https://www.tripit.com/web/blog/news-culture/5-things-travel-safety-risk</w:t>
+      </w:r>
+    </w:p>
+    <w:p>
+      <w:pPr>
+        <w:pStyle w:val="Heading3"/>
+      </w:pPr>
+      <w:r>
+        <w:t xml:space="preserve"> </w:t>
+      </w:r>
+      <w:r>
+        <w:t xml:space="preserve">  </w:t>
+      </w:r>
+      <w:r>
+        <w:rPr>
+          <w:i/>
+          <w:iCs/>
+        </w:rPr>
+        <w:t xml:space="preserve"> </w:t>
+      </w:r>
+      <w:r>
+        <w:rPr>
+          <w:i/>
+          <w:iCs/>
+        </w:rPr>
+        <w:br w:type="page"/>
+      </w:r>
+      <w:bookmarkStart w:id="7" w:name="_Toc241419973"/>
+      <w:r>
+        <w:lastRenderedPageBreak/>
+        <w:t xml:space="preserve">1.1.2. </w:t>
+      </w:r>
+      <w:r>
+        <w:t>Business Objectives</w:t>
+      </w:r>
+      <w:bookmarkEnd w:id="7"/>
+    </w:p>
+    <w:p/>
+    <w:p>
+      <w:pPr>
+        <w:pStyle w:val="Heading4"/>
+      </w:pPr>
+      <w:r>
+        <w:t xml:space="preserve">Primary </w:t>
+      </w:r>
+      <w:r>
+        <w:t>B</w:t>
+      </w:r>
+      <w:r>
+        <w:t xml:space="preserve">usiness </w:t>
+      </w:r>
+      <w:r>
+        <w:t>O</w:t>
+      </w:r>
+      <w:r>
+        <w:t>bjectiv</w:t>
+      </w:r>
+      <w:r>
+        <w:t>e</w:t>
+      </w:r>
+    </w:p>
+    <w:p>
+      <w:r>
+        <w:t>To</w:t>
+      </w:r>
+      <w:r>
+        <w:t xml:space="preserve"> aid users reduce travel stress through</w:t>
+      </w:r>
+      <w:r>
+        <w:t xml:space="preserve"> </w:t>
+      </w:r>
+      <w:r>
+        <w:t>a predictive</w:t>
+      </w:r>
+      <w:r>
+        <w:t xml:space="preserve"> web</w:t>
+      </w:r>
+      <w:r>
+        <w:t xml:space="preserve"> </w:t>
+      </w:r>
+      <w:r>
+        <w:t>app</w:t>
+      </w:r>
+      <w:r>
+        <w:t>lication</w:t>
+      </w:r>
+      <w:r>
+        <w:t xml:space="preserve"> which</w:t>
+      </w:r>
+      <w:r>
+        <w:t xml:space="preserve"> calculates and displays the probability of a flight delay of 15 minutes or </w:t>
+      </w:r>
+      <w:r>
+        <w:t>greater</w:t>
+      </w:r>
+      <w:r>
+        <w:t xml:space="preserve"> using live and historical public data</w:t>
+      </w:r>
+      <w:r>
+        <w:t>.</w:t>
+      </w:r>
+    </w:p>
+    <w:p/>
+    <w:p>
+      <w:pPr>
+        <w:pStyle w:val="Heading4"/>
+      </w:pPr>
+      <w:r>
+        <w:t>Secondary Business Objectives</w:t>
+      </w:r>
+    </w:p>
+    <w:p>
+      <w:pPr>
+        <w:pStyle w:val="ListParagraph"/>
+        <w:numPr>
+          <w:ilvl w:val="0"/>
+          <w:numId w:val="12"/>
+        </w:numPr>
+      </w:pPr>
+      <w:r>
+        <w:t xml:space="preserve">To output the ‘reasoning’ information </w:t>
+      </w:r>
+      <w:r>
+        <w:t xml:space="preserve">associated with a </w:t>
+      </w:r>
+      <w:r>
+        <w:t>prediction in a clear and understandable</w:t>
+      </w:r>
+      <w:r>
+        <w:t xml:space="preserve"> </w:t>
+      </w:r>
+      <w:r>
+        <w:t>way</w:t>
+      </w:r>
+      <w:r>
+        <w:t>.</w:t>
+      </w:r>
+    </w:p>
+    <w:p>
+      <w:pPr>
+        <w:pStyle w:val="ListParagraph"/>
+        <w:numPr>
+          <w:ilvl w:val="0"/>
+          <w:numId w:val="12"/>
+        </w:numPr>
+      </w:pPr>
+      <w:r>
+        <w:t>To compute the delay prediction along</w:t>
+      </w:r>
+      <w:r>
+        <w:t xml:space="preserve"> staggered </w:t>
+      </w:r>
+      <w:r>
+        <w:t>intervals and allow users to subscribe to</w:t>
+      </w:r>
+      <w:r>
+        <w:t xml:space="preserve"> </w:t>
+      </w:r>
+      <w:r>
+        <w:t>updates through convenient means.</w:t>
+      </w:r>
+    </w:p>
+    <w:p>
+      <w:pPr>
+        <w:pStyle w:val="ListParagraph"/>
+        <w:numPr>
+          <w:ilvl w:val="0"/>
+          <w:numId w:val="12"/>
+        </w:numPr>
+      </w:pPr>
+      <w:r>
+        <w:t>To provide an understandable confidence score for each prediction.</w:t>
+      </w:r>
+    </w:p>
+    <w:p>
+      <w:pPr>
+        <w:pStyle w:val="ListParagraph"/>
+        <w:numPr>
+          <w:ilvl w:val="0"/>
+          <w:numId w:val="12"/>
+        </w:numPr>
+      </w:pPr>
+      <w:r>
+        <w:t>To publish and share model performance to users in a transparent manner.</w:t>
+      </w:r>
+    </w:p>
+    <w:p>
+      <w:pPr>
+        <w:pStyle w:val="ListParagraph"/>
+        <w:numPr>
+          <w:ilvl w:val="0"/>
+          <w:numId w:val="12"/>
+        </w:numPr>
+      </w:pPr>
+      <w:r>
+        <w:t>To minimise cost and prioritise reliability through utilising cloud services where appropriate.</w:t>
+      </w:r>
+    </w:p>
+    <w:p>
+      <w:pPr>
+        <w:pStyle w:val="ListParagraph"/>
+        <w:numPr>
+          <w:ilvl w:val="0"/>
+          <w:numId w:val="12"/>
+        </w:numPr>
+      </w:pPr>
+      <w:r>
+        <w:t>To follow all data provider usage policies.</w:t>
+      </w:r>
+    </w:p>
+    <w:p/>
+    <w:p>
+      <w:pPr>
+        <w:pStyle w:val="Heading3"/>
+      </w:pPr>
+      <w:bookmarkStart w:id="8" w:name="_Toc241419974"/>
+      <w:r>
+        <w:t xml:space="preserve">1.1.3. </w:t>
+      </w:r>
+      <w:r>
+        <w:t>Business Success Criteria</w:t>
+      </w:r>
+      <w:bookmarkEnd w:id="8"/>
+    </w:p>
+    <w:p>
+      <w:pPr>
+        <w:pStyle w:val="ListParagraph"/>
+        <w:numPr>
+          <w:ilvl w:val="0"/>
+          <w:numId w:val="14"/>
+        </w:numPr>
+      </w:pPr>
+      <w:r>
+        <w:t>Given</w:t>
+      </w:r>
+      <w:r>
+        <w:t xml:space="preserve"> only a flight code</w:t>
+      </w:r>
+      <w:r>
+        <w:t xml:space="preserve">, </w:t>
+      </w:r>
+      <w:r>
+        <w:rPr>
+          <w:i/>
+          <w:iCs/>
+        </w:rPr>
+        <w:t xml:space="preserve">e.g., </w:t>
+      </w:r>
+      <w:r>
+        <w:t>EI2043</w:t>
+      </w:r>
+      <w:r>
+        <w:t xml:space="preserve">, the web application can make a prediction for </w:t>
+      </w:r>
+      <w:r>
+        <w:t>flight delay and display that prediction to users.</w:t>
+      </w:r>
+    </w:p>
+    <w:p>
+      <w:pPr>
+        <w:pStyle w:val="ListParagraph"/>
+        <w:numPr>
+          <w:ilvl w:val="0"/>
+          <w:numId w:val="14"/>
+        </w:numPr>
         <w:rPr>
           <w:b/>
           <w:bCs/>
-          <w:sz w:val="32"/>
-          <w:szCs w:val="32"/>
-        </w:rPr>
-      </w:pPr>
-      <w:r>
-        <w:br w:type="page"/>
-      </w:r>
-    </w:p>
-    <w:p>
-      <w:pPr>
-        <w:pStyle w:val="Heading3"/>
-      </w:pPr>
-      <w:bookmarkStart w:id="7" w:name="_Toc241419973"/>
-      <w:r>
-        <w:lastRenderedPageBreak/>
-        <w:t xml:space="preserve">1.1.2. </w:t>
-      </w:r>
-      <w:r>
-        <w:t>Business Objectives</w:t>
-      </w:r>
-      <w:bookmarkEnd w:id="7"/>
-    </w:p>
-    <w:p/>
-    <w:p>
-      <w:pPr>
-        <w:pStyle w:val="Heading4"/>
-      </w:pPr>
-      <w:r>
-        <w:t xml:space="preserve">Primary business </w:t>
-      </w:r>
-      <w:r>
-        <w:t>O</w:t>
-      </w:r>
-      <w:r>
-        <w:t>bjectiv</w:t>
-      </w:r>
-      <w:r>
-        <w:t>e</w:t>
-      </w:r>
-    </w:p>
-    <w:p>
-      <w:r>
-        <w:t xml:space="preserve">To </w:t>
-      </w:r>
-      <w:r>
-        <w:t xml:space="preserve">build a predictive </w:t>
-      </w:r>
-      <w:r>
-        <w:t>application which</w:t>
-      </w:r>
-      <w:r>
-        <w:t xml:space="preserve"> calculates and displays the probability of a flight delay of 15 minutes or </w:t>
-      </w:r>
-      <w:r>
-        <w:t>greater</w:t>
-      </w:r>
-      <w:r>
-        <w:t xml:space="preserve"> using live and historical public data</w:t>
-      </w:r>
-      <w:r>
-        <w:t>.</w:t>
-      </w:r>
-    </w:p>
-    <w:p/>
-    <w:p>
-      <w:pPr>
-        <w:pStyle w:val="Heading4"/>
-      </w:pPr>
-      <w:r>
-        <w:t>Secondary Business Objectives</w:t>
-      </w:r>
-    </w:p>
-    <w:p>
-      <w:pPr>
-        <w:ind w:left="720" w:hanging="720"/>
-      </w:pPr>
-      <w:r>
-        <w:t>S-1</w:t>
-      </w:r>
-      <w:r>
-        <w:tab/>
-        <w:t>To output the ‘reasoning’ information for a computed delay prediction in a clear and understandable format for users.</w:t>
-      </w:r>
-    </w:p>
-    <w:p>
-      <w:pPr>
-        <w:ind w:left="720" w:hanging="720"/>
-      </w:pPr>
-      <w:r>
-        <w:t>S-2</w:t>
-      </w:r>
-      <w:r>
-        <w:tab/>
-        <w:t>To compute the delay prediction along staggered intervals and allow users to subscribe to ongoing updates through convenient means.</w:t>
-      </w:r>
-    </w:p>
-    <w:p>
-      <w:pPr>
-        <w:ind w:left="720" w:hanging="720"/>
-      </w:pPr>
-      <w:r>
-        <w:t>S-3</w:t>
-      </w:r>
-      <w:r>
-        <w:tab/>
-      </w:r>
-    </w:p>
-    <w:p/>
-    <w:p>
-      <w:pPr>
-        <w:pStyle w:val="Heading3"/>
-      </w:pPr>
-      <w:bookmarkStart w:id="8" w:name="_Toc241419974"/>
-      <w:r>
-        <w:t xml:space="preserve">1.1.3. </w:t>
-      </w:r>
-      <w:r>
-        <w:t>Business Success Criteria</w:t>
-      </w:r>
-      <w:bookmarkEnd w:id="8"/>
-    </w:p>
-    <w:p/>
-    <w:p/>
-    <w:p>
-      <w:pPr>
-        <w:spacing w:after="160" w:line="278" w:lineRule="auto"/>
-        <w:rPr>
-          <w:rFonts w:eastAsiaTheme="majorEastAsia" w:cstheme="majorBidi"/>
+        </w:rPr>
+      </w:pPr>
+      <w:r>
+        <w:t>A prediction is available for at least 90% of flights departing from Dublin, Cork, and Shannon airport.</w:t>
+      </w:r>
+    </w:p>
+    <w:p>
+      <w:pPr>
+        <w:pStyle w:val="ListParagraph"/>
+        <w:numPr>
+          <w:ilvl w:val="0"/>
+          <w:numId w:val="14"/>
+        </w:numPr>
+        <w:rPr>
           <w:b/>
           <w:bCs/>
-          <w:color w:val="000000" w:themeColor="text1"/>
-          <w:sz w:val="36"/>
-          <w:szCs w:val="36"/>
+        </w:rPr>
+      </w:pPr>
+      <w:r>
+        <w:t>The average time to make a prediction is less than 15 second</w:t>
+      </w:r>
+      <w:r>
+        <w:t>s, from web server-to-web server.</w:t>
+      </w:r>
+    </w:p>
+    <w:p>
+      <w:pPr>
+        <w:pStyle w:val="ListParagraph"/>
+        <w:numPr>
+          <w:ilvl w:val="0"/>
+          <w:numId w:val="14"/>
+        </w:numPr>
+        <w:rPr>
+          <w:b/>
+          <w:bCs/>
+        </w:rPr>
+      </w:pPr>
+      <w:r>
+        <w:t>The accuracy of predictions</w:t>
+      </w:r>
+      <w:r>
+        <w:t xml:space="preserve"> made by the system at least match</w:t>
+      </w:r>
+      <w:r>
+        <w:t xml:space="preserve"> those of</w:t>
+      </w:r>
+      <w:r>
+        <w:t xml:space="preserve"> a naïve model which assumes each flight will depart on-time</w:t>
+      </w:r>
+      <w:r>
+        <w:t>, as measured over a one-week period.</w:t>
+      </w:r>
+    </w:p>
+    <w:p>
+      <w:pPr>
+        <w:pStyle w:val="ListParagraph"/>
+        <w:numPr>
+          <w:ilvl w:val="0"/>
+          <w:numId w:val="14"/>
+        </w:numPr>
+        <w:rPr>
+          <w:b/>
+          <w:bCs/>
+        </w:rPr>
+      </w:pPr>
+      <w:r>
+        <w:t>The monthly cost of the project does not exceed €50 at any time.</w:t>
+      </w:r>
+    </w:p>
+    <w:p>
+      <w:pPr>
+        <w:pStyle w:val="ListParagraph"/>
+        <w:numPr>
+          <w:ilvl w:val="0"/>
+          <w:numId w:val="14"/>
+        </w:numPr>
+        <w:rPr>
+          <w:b/>
+          <w:bCs/>
+        </w:rPr>
+      </w:pPr>
+      <w:r>
+        <w:t>The average monthly cost of the project does not exceed €30 for any 6-month period.</w:t>
+      </w:r>
+    </w:p>
+    <w:p>
+      <w:pPr>
+        <w:pStyle w:val="Heading2"/>
+        <w:rPr>
+          <w:rFonts w:eastAsia="Times New Roman"/>
         </w:rPr>
       </w:pPr>
       <w:r>
         <w:br w:type="page"/>
       </w:r>
-    </w:p>
-    <w:p>
-      <w:pPr>
-        <w:pStyle w:val="Heading2"/>
-      </w:pPr>
       <w:bookmarkStart w:id="9" w:name="_Toc241419975"/>
       <w:r>
         <w:lastRenderedPageBreak/>
@@ -3804,7 +4439,6 @@
         <w:t>Resources</w:t>
       </w:r>
     </w:p>
-    <w:p/>
     <w:p>
       <w:pPr>
         <w:pStyle w:val="Heading4"/>
@@ -3848,6 +4482,34 @@
     </w:p>
     <w:p>
       <w:pPr>
+        <w:pStyle w:val="Heading5"/>
+      </w:pPr>
+      <w:r>
+        <w:t>Hardware</w:t>
+      </w:r>
+    </w:p>
+    <w:p>
+      <w:pPr>
+        <w:pStyle w:val="ListParagraph"/>
+        <w:numPr>
+          <w:ilvl w:val="0"/>
+          <w:numId w:val="15"/>
+        </w:numPr>
+      </w:pPr>
+      <w:r>
+        <w:t>Apple MacBook Pro laptop used for training.</w:t>
+      </w:r>
+    </w:p>
+    <w:p>
+      <w:pPr>
+        <w:pStyle w:val="Heading5"/>
+      </w:pPr>
+      <w:r>
+        <w:t>Cloud</w:t>
+      </w:r>
+    </w:p>
+    <w:p>
+      <w:pPr>
         <w:pStyle w:val="ListParagraph"/>
         <w:numPr>
           <w:ilvl w:val="0"/>
@@ -3870,6 +4532,100 @@
         <w:t>AWS S3, an object store offering by AWS used to store both structured and semi-structured data.</w:t>
       </w:r>
     </w:p>
+    <w:p>
+      <w:pPr>
+        <w:pStyle w:val="ListParagraph"/>
+        <w:numPr>
+          <w:ilvl w:val="0"/>
+          <w:numId w:val="10"/>
+        </w:numPr>
+      </w:pPr>
+      <w:r>
+        <w:t>Neon PostgreSQL database.</w:t>
+      </w:r>
+    </w:p>
+    <w:p>
+      <w:pPr>
+        <w:pStyle w:val="Heading5"/>
+      </w:pPr>
+      <w:r>
+        <w:t>Software</w:t>
+      </w:r>
+    </w:p>
+    <w:p>
+      <w:pPr>
+        <w:pStyle w:val="ListParagraph"/>
+        <w:numPr>
+          <w:ilvl w:val="0"/>
+          <w:numId w:val="10"/>
+        </w:numPr>
+      </w:pPr>
+      <w:r>
+        <w:t>Express and Node for application middleware and backend.</w:t>
+      </w:r>
+    </w:p>
+    <w:p>
+      <w:pPr>
+        <w:pStyle w:val="ListParagraph"/>
+        <w:numPr>
+          <w:ilvl w:val="0"/>
+          <w:numId w:val="10"/>
+        </w:numPr>
+      </w:pPr>
+      <w:r>
+        <w:t>JavaScript</w:t>
+      </w:r>
+      <w:r>
+        <w:t xml:space="preserve"> for application programming.</w:t>
+      </w:r>
+    </w:p>
+    <w:p>
+      <w:pPr>
+        <w:pStyle w:val="ListParagraph"/>
+        <w:numPr>
+          <w:ilvl w:val="0"/>
+          <w:numId w:val="10"/>
+        </w:numPr>
+      </w:pPr>
+      <w:r>
+        <w:t>Python</w:t>
+      </w:r>
+      <w:r>
+        <w:t xml:space="preserve"> for AWS and data engineering.</w:t>
+      </w:r>
+    </w:p>
+    <w:p>
+      <w:pPr>
+        <w:pStyle w:val="ListParagraph"/>
+        <w:numPr>
+          <w:ilvl w:val="0"/>
+          <w:numId w:val="10"/>
+        </w:numPr>
+      </w:pPr>
+      <w:r>
+        <w:t xml:space="preserve">Google </w:t>
+      </w:r>
+      <w:proofErr w:type="spellStart"/>
+      <w:r>
+        <w:t>Colab</w:t>
+      </w:r>
+      <w:proofErr w:type="spellEnd"/>
+      <w:r>
+        <w:t xml:space="preserve"> for data investigation and experimentation. </w:t>
+      </w:r>
+    </w:p>
+    <w:p>
+      <w:pPr>
+        <w:pStyle w:val="ListParagraph"/>
+        <w:numPr>
+          <w:ilvl w:val="0"/>
+          <w:numId w:val="10"/>
+        </w:numPr>
+      </w:pPr>
+      <w:r>
+        <w:t>Miro for project management.</w:t>
+      </w:r>
+    </w:p>
     <w:p/>
     <w:p>
       <w:pPr>
@@ -3907,26 +4663,17 @@
       </w:pPr>
       <w:bookmarkStart w:id="11" w:name="_Toc241419897"/>
       <w:r>
+        <w:lastRenderedPageBreak/>
         <w:t xml:space="preserve">Table </w:t>
       </w:r>
-      <w:r>
-        <w:fldChar w:fldCharType="begin"/>
-      </w:r>
-      <w:r>
-        <w:instrText xml:space="preserve"> SEQ Table \* ARABIC </w:instrText>
-      </w:r>
-      <w:r>
-        <w:fldChar w:fldCharType="separate"/>
-      </w:r>
-      <w:r>
-        <w:rPr>
-          <w:noProof/>
-        </w:rPr>
-        <w:t>1</w:t>
-      </w:r>
-      <w:r>
-        <w:fldChar w:fldCharType="end"/>
-      </w:r>
+      <w:fldSimple w:instr=" SEQ Table \* ARABIC ">
+        <w:r>
+          <w:rPr>
+            <w:noProof/>
+          </w:rPr>
+          <w:t>1</w:t>
+        </w:r>
+      </w:fldSimple>
       <w:r>
         <w:t xml:space="preserve"> Aviation Weather </w:t>
       </w:r>
@@ -4178,7 +4925,7 @@
               <w:rPr>
                 <w:lang w:val="en-GB"/>
               </w:rPr>
-              <w:t>SIGMETs</w:t>
+              <w:t>SIGMET</w:t>
             </w:r>
           </w:p>
         </w:tc>
@@ -4251,7 +4998,6 @@
               <w:rPr>
                 <w:lang w:val="en-GB"/>
               </w:rPr>
-              <w:lastRenderedPageBreak/>
               <w:t>Station info</w:t>
             </w:r>
           </w:p>
@@ -4401,27 +5147,13 @@
         </w:rPr>
         <w:t xml:space="preserve">AWC Data API documentation: </w:t>
       </w:r>
-      <w:hyperlink r:id="rId9" w:history="1">
+      <w:hyperlink r:id="rId13" w:history="1">
         <w:r>
           <w:rPr>
             <w:rStyle w:val="Hyperlink"/>
             <w:lang w:val="en-GB"/>
           </w:rPr>
-          <w:t>h</w:t>
-        </w:r>
-        <w:r>
-          <w:rPr>
-            <w:rStyle w:val="Hyperlink"/>
-            <w:lang w:val="en-GB"/>
-          </w:rPr>
-          <w:t>t</w:t>
-        </w:r>
-        <w:r>
-          <w:rPr>
-            <w:rStyle w:val="Hyperlink"/>
-            <w:lang w:val="en-GB"/>
-          </w:rPr>
-          <w:t>tps://aviationweather.gov/data/api/</w:t>
+          <w:t>https://aviationweather.gov/data/api/</w:t>
         </w:r>
       </w:hyperlink>
     </w:p>
@@ -4456,24 +5188,14 @@
       <w:r>
         <w:t xml:space="preserve">Table </w:t>
       </w:r>
-      <w:r>
-        <w:fldChar w:fldCharType="begin"/>
-      </w:r>
-      <w:r>
-        <w:instrText xml:space="preserve"> SEQ Table \* ARABIC </w:instrText>
-      </w:r>
-      <w:r>
-        <w:fldChar w:fldCharType="separate"/>
-      </w:r>
-      <w:r>
-        <w:rPr>
-          <w:noProof/>
-        </w:rPr>
-        <w:t>2</w:t>
-      </w:r>
-      <w:r>
-        <w:fldChar w:fldCharType="end"/>
-      </w:r>
+      <w:fldSimple w:instr=" SEQ Table \* ARABIC ">
+        <w:r>
+          <w:rPr>
+            <w:noProof/>
+          </w:rPr>
+          <w:t>2</w:t>
+        </w:r>
+      </w:fldSimple>
       <w:r>
         <w:t xml:space="preserve"> Met Eireann data products</w:t>
       </w:r>
@@ -4679,7 +5401,7 @@
         </w:rPr>
         <w:t xml:space="preserve">Met Eireann Open Data documentation: </w:t>
       </w:r>
-      <w:hyperlink r:id="rId10" w:history="1">
+      <w:hyperlink r:id="rId14" w:history="1">
         <w:r>
           <w:rPr>
             <w:rStyle w:val="Hyperlink"/>
@@ -4791,11 +5513,7 @@
     </w:p>
     <w:p>
       <w:r>
-        <w:t xml:space="preserve">Due to the necessity of building a large corpus of data, only Dublin, Cork, and Shannon Airport will be considered by the system. In 2025, these three airports accounted for 97% of all passenger traffic </w:t>
-      </w:r>
-      <w:r>
-        <w:lastRenderedPageBreak/>
-        <w:t>in Ireland (https://www.cso.ie/en/releasesandpublications/ep/p-as/aviationstatisticsquarter4andyear2025/).</w:t>
+        <w:t>Due to the necessity of building a large corpus of data, only Dublin, Cork, and Shannon Airport will be considered by the system. In 2025, these three airports accounted for 97% of all passenger traffic in Ireland (https://www.cso.ie/en/releasesandpublications/ep/p-as/aviationstatisticsquarter4andyear2025/).</w:t>
       </w:r>
     </w:p>
     <w:p>
@@ -4812,16 +5530,27 @@
       </w:r>
     </w:p>
     <w:p>
-      <w:r>
-        <w:t>C-1</w:t>
-      </w:r>
-      <w:r>
-        <w:tab/>
-      </w:r>
-      <w:r>
-        <w:t>The schedule for submission dates must be met. TBC.</w:t>
-      </w:r>
-    </w:p>
+      <w:pPr>
+        <w:pStyle w:val="ListParagraph"/>
+        <w:numPr>
+          <w:ilvl w:val="0"/>
+          <w:numId w:val="16"/>
+        </w:numPr>
+      </w:pPr>
+      <w:r>
+        <w:t>The schedule for submission dates must be met.</w:t>
+      </w:r>
+    </w:p>
+    <w:p>
+      <w:pPr>
+        <w:pStyle w:val="ListParagraph"/>
+        <w:numPr>
+          <w:ilvl w:val="0"/>
+          <w:numId w:val="16"/>
+        </w:numPr>
+      </w:pPr>
+    </w:p>
+    <w:p/>
     <w:p/>
     <w:p/>
     <w:p>
@@ -5148,6 +5877,7 @@
               <w:rPr>
                 <w:lang w:val="en-GB"/>
               </w:rPr>
+              <w:lastRenderedPageBreak/>
               <w:t>FAA</w:t>
             </w:r>
           </w:p>
@@ -5516,7 +6246,6 @@
               <w:rPr>
                 <w:lang w:val="en-GB"/>
               </w:rPr>
-              <w:lastRenderedPageBreak/>
               <w:t>TAF</w:t>
             </w:r>
           </w:p>
@@ -6082,9 +6811,9 @@
       </w:r>
     </w:p>
     <w:sectPr>
-      <w:headerReference w:type="default" r:id="rId11"/>
-      <w:footerReference w:type="even" r:id="rId12"/>
-      <w:footerReference w:type="default" r:id="rId13"/>
+      <w:headerReference w:type="default" r:id="rId15"/>
+      <w:footerReference w:type="even" r:id="rId16"/>
+      <w:footerReference w:type="default" r:id="rId17"/>
       <w:pgSz w:w="11906" w:h="16838"/>
       <w:pgMar w:top="1440" w:right="1134" w:bottom="1440" w:left="1134" w:header="709" w:footer="709" w:gutter="0"/>
       <w:cols w:space="708"/>
@@ -6298,13 +7027,8 @@
     <w:r>
       <w:tab/>
     </w:r>
-    <w:proofErr w:type="spellStart"/>
     <w:r>
-      <w:t>Aeroq</w:t>
-    </w:r>
-    <w:proofErr w:type="spellEnd"/>
-    <w:r>
-      <w:t>: CRISP-DM Process Document</w:t>
+      <w:t>Aeroq: CRISP-DM Process Document</w:t>
     </w:r>
   </w:p>
 </w:hdr>
@@ -6313,6 +7037,232 @@
 <file path=word/numbering.xml><?xml version="1.0" encoding="utf-8"?>
 <w:numbering xmlns:wpc="http://schemas.microsoft.com/office/word/2010/wordprocessingCanvas" xmlns:cx="http://schemas.microsoft.com/office/drawing/2014/chartex" xmlns:cx1="http://schemas.microsoft.com/office/drawing/2015/9/8/chartex" xmlns:cx2="http://schemas.microsoft.com/office/drawing/2015/10/21/chartex" xmlns:cx3="http://schemas.microsoft.com/office/drawing/2016/5/9/chartex" xmlns:cx4="http://schemas.microsoft.com/office/drawing/2016/5/10/chartex" xmlns:cx5="http://schemas.microsoft.com/office/drawing/2016/5/11/chartex" xmlns:cx6="http://schemas.microsoft.com/office/drawing/2016/5/12/chartex" xmlns:cx7="http://schemas.microsoft.com/office/drawing/2016/5/13/chartex" xmlns:cx8="http://schemas.microsoft.com/office/drawing/2016/5/14/chartex" xmlns:mc="http://schemas.openxmlformats.org/markup-compatibility/2006" xmlns:m="http://schemas.openxmlformats.org/officeDocument/2006/math" xmlns:aink="http://schemas.microsoft.com/office/drawing/2016/ink" xmlns:am3d="http://schemas.microsoft.com/office/drawing/2017/model3d" xmlns:oel="http://schemas.microsoft.com/office/2019/extlst" xmlns:r="http://schemas.openxmlformats.org/officeDocument/2006/relationships" xmlns:wp14="http://schemas.microsoft.com/office/word/2010/wordprocessingDrawing" xmlns:wp="http://schemas.openxmlformats.org/drawingml/2006/wordprocessingDrawing" xmlns:wpg="http://schemas.microsoft.com/office/word/2010/wordprocessingGroup" xmlns:wpi="http://schemas.microsoft.com/office/word/2010/wordprocessingInk" xmlns:wps="http://schemas.microsoft.com/office/word/2010/wordprocessingShape" xmlns:o="urn:schemas-microsoft-com:office:office" xmlns:v="urn:schemas-microsoft-com:vml" xmlns:w10="urn:schemas-microsoft-com:office:word" xmlns:w="http://schemas.openxmlformats.org/wordprocessingml/2006/main" xmlns:w14="http://schemas.microsoft.com/office/word/2010/wordml" xmlns:w15="http://schemas.microsoft.com/office/word/2012/wordml" xmlns:w16cex="http://schemas.microsoft.com/office/word/2018/wordml/cex" xmlns:w16cid="http://schemas.microsoft.com/office/word/2016/wordml/cid" xmlns:w16="http://schemas.microsoft.com/office/word/2018/wordml" xmlns:w16sdtdh="http://schemas.microsoft.com/office/word/2020/wordml/sdtdatahash" xmlns:w16sdtfl="http://schemas.microsoft.com/office/word/2024/wordml/sdtformatlock" xmlns:w16se="http://schemas.microsoft.com/office/word/2015/wordml/symex" xmlns:w16du="http://schemas.microsoft.com/office/word/2023/wordml/word16du" xmlns:wne="http://schemas.microsoft.com/office/word/2006/wordml" mc:Ignorable="w14 w15 w16se w16cid w16 w16cex w16sdtdh w16sdtfl w16du wp14">
   <w:abstractNum w:abstractNumId="0" w15:restartNumberingAfterBreak="0">
+    <w:nsid w:val="05315F6D"/>
+    <w:multiLevelType w:val="hybridMultilevel"/>
+    <w:tmpl w:val="6C520458"/>
+    <w:lvl w:ilvl="0" w:tplc="08090001">
+      <w:start w:val="1"/>
+      <w:numFmt w:val="bullet"/>
+      <w:lvlText w:val=""/>
+      <w:lvlJc w:val="left"/>
+      <w:pPr>
+        <w:ind w:left="720" w:hanging="360"/>
+      </w:pPr>
+      <w:rPr>
+        <w:rFonts w:ascii="Symbol" w:hAnsi="Symbol" w:hint="default"/>
+      </w:rPr>
+    </w:lvl>
+    <w:lvl w:ilvl="1" w:tplc="08090003" w:tentative="1">
+      <w:start w:val="1"/>
+      <w:numFmt w:val="bullet"/>
+      <w:lvlText w:val="o"/>
+      <w:lvlJc w:val="left"/>
+      <w:pPr>
+        <w:ind w:left="1440" w:hanging="360"/>
+      </w:pPr>
+      <w:rPr>
+        <w:rFonts w:ascii="Courier New" w:hAnsi="Courier New" w:hint="default"/>
+      </w:rPr>
+    </w:lvl>
+    <w:lvl w:ilvl="2" w:tplc="08090005" w:tentative="1">
+      <w:start w:val="1"/>
+      <w:numFmt w:val="bullet"/>
+      <w:lvlText w:val=""/>
+      <w:lvlJc w:val="left"/>
+      <w:pPr>
+        <w:ind w:left="2160" w:hanging="360"/>
+      </w:pPr>
+      <w:rPr>
+        <w:rFonts w:ascii="Wingdings" w:hAnsi="Wingdings" w:hint="default"/>
+      </w:rPr>
+    </w:lvl>
+    <w:lvl w:ilvl="3" w:tplc="08090001" w:tentative="1">
+      <w:start w:val="1"/>
+      <w:numFmt w:val="bullet"/>
+      <w:lvlText w:val=""/>
+      <w:lvlJc w:val="left"/>
+      <w:pPr>
+        <w:ind w:left="2880" w:hanging="360"/>
+      </w:pPr>
+      <w:rPr>
+        <w:rFonts w:ascii="Symbol" w:hAnsi="Symbol" w:hint="default"/>
+      </w:rPr>
+    </w:lvl>
+    <w:lvl w:ilvl="4" w:tplc="08090003" w:tentative="1">
+      <w:start w:val="1"/>
+      <w:numFmt w:val="bullet"/>
+      <w:lvlText w:val="o"/>
+      <w:lvlJc w:val="left"/>
+      <w:pPr>
+        <w:ind w:left="3600" w:hanging="360"/>
+      </w:pPr>
+      <w:rPr>
+        <w:rFonts w:ascii="Courier New" w:hAnsi="Courier New" w:hint="default"/>
+      </w:rPr>
+    </w:lvl>
+    <w:lvl w:ilvl="5" w:tplc="08090005" w:tentative="1">
+      <w:start w:val="1"/>
+      <w:numFmt w:val="bullet"/>
+      <w:lvlText w:val=""/>
+      <w:lvlJc w:val="left"/>
+      <w:pPr>
+        <w:ind w:left="4320" w:hanging="360"/>
+      </w:pPr>
+      <w:rPr>
+        <w:rFonts w:ascii="Wingdings" w:hAnsi="Wingdings" w:hint="default"/>
+      </w:rPr>
+    </w:lvl>
+    <w:lvl w:ilvl="6" w:tplc="08090001" w:tentative="1">
+      <w:start w:val="1"/>
+      <w:numFmt w:val="bullet"/>
+      <w:lvlText w:val=""/>
+      <w:lvlJc w:val="left"/>
+      <w:pPr>
+        <w:ind w:left="5040" w:hanging="360"/>
+      </w:pPr>
+      <w:rPr>
+        <w:rFonts w:ascii="Symbol" w:hAnsi="Symbol" w:hint="default"/>
+      </w:rPr>
+    </w:lvl>
+    <w:lvl w:ilvl="7" w:tplc="08090003" w:tentative="1">
+      <w:start w:val="1"/>
+      <w:numFmt w:val="bullet"/>
+      <w:lvlText w:val="o"/>
+      <w:lvlJc w:val="left"/>
+      <w:pPr>
+        <w:ind w:left="5760" w:hanging="360"/>
+      </w:pPr>
+      <w:rPr>
+        <w:rFonts w:ascii="Courier New" w:hAnsi="Courier New" w:hint="default"/>
+      </w:rPr>
+    </w:lvl>
+    <w:lvl w:ilvl="8" w:tplc="08090005" w:tentative="1">
+      <w:start w:val="1"/>
+      <w:numFmt w:val="bullet"/>
+      <w:lvlText w:val=""/>
+      <w:lvlJc w:val="left"/>
+      <w:pPr>
+        <w:ind w:left="6480" w:hanging="360"/>
+      </w:pPr>
+      <w:rPr>
+        <w:rFonts w:ascii="Wingdings" w:hAnsi="Wingdings" w:hint="default"/>
+      </w:rPr>
+    </w:lvl>
+  </w:abstractNum>
+  <w:abstractNum w:abstractNumId="1" w15:restartNumberingAfterBreak="0">
+    <w:nsid w:val="07EF0EF8"/>
+    <w:multiLevelType w:val="hybridMultilevel"/>
+    <w:tmpl w:val="EF6CBF9E"/>
+    <w:lvl w:ilvl="0" w:tplc="08090001">
+      <w:start w:val="1"/>
+      <w:numFmt w:val="bullet"/>
+      <w:lvlText w:val=""/>
+      <w:lvlJc w:val="left"/>
+      <w:pPr>
+        <w:ind w:left="720" w:hanging="360"/>
+      </w:pPr>
+      <w:rPr>
+        <w:rFonts w:ascii="Symbol" w:hAnsi="Symbol" w:hint="default"/>
+      </w:rPr>
+    </w:lvl>
+    <w:lvl w:ilvl="1" w:tplc="08090003" w:tentative="1">
+      <w:start w:val="1"/>
+      <w:numFmt w:val="bullet"/>
+      <w:lvlText w:val="o"/>
+      <w:lvlJc w:val="left"/>
+      <w:pPr>
+        <w:ind w:left="1440" w:hanging="360"/>
+      </w:pPr>
+      <w:rPr>
+        <w:rFonts w:ascii="Courier New" w:hAnsi="Courier New" w:hint="default"/>
+      </w:rPr>
+    </w:lvl>
+    <w:lvl w:ilvl="2" w:tplc="08090005" w:tentative="1">
+      <w:start w:val="1"/>
+      <w:numFmt w:val="bullet"/>
+      <w:lvlText w:val=""/>
+      <w:lvlJc w:val="left"/>
+      <w:pPr>
+        <w:ind w:left="2160" w:hanging="360"/>
+      </w:pPr>
+      <w:rPr>
+        <w:rFonts w:ascii="Wingdings" w:hAnsi="Wingdings" w:hint="default"/>
+      </w:rPr>
+    </w:lvl>
+    <w:lvl w:ilvl="3" w:tplc="08090001" w:tentative="1">
+      <w:start w:val="1"/>
+      <w:numFmt w:val="bullet"/>
+      <w:lvlText w:val=""/>
+      <w:lvlJc w:val="left"/>
+      <w:pPr>
+        <w:ind w:left="2880" w:hanging="360"/>
+      </w:pPr>
+      <w:rPr>
+        <w:rFonts w:ascii="Symbol" w:hAnsi="Symbol" w:hint="default"/>
+      </w:rPr>
+    </w:lvl>
+    <w:lvl w:ilvl="4" w:tplc="08090003" w:tentative="1">
+      <w:start w:val="1"/>
+      <w:numFmt w:val="bullet"/>
+      <w:lvlText w:val="o"/>
+      <w:lvlJc w:val="left"/>
+      <w:pPr>
+        <w:ind w:left="3600" w:hanging="360"/>
+      </w:pPr>
+      <w:rPr>
+        <w:rFonts w:ascii="Courier New" w:hAnsi="Courier New" w:hint="default"/>
+      </w:rPr>
+    </w:lvl>
+    <w:lvl w:ilvl="5" w:tplc="08090005" w:tentative="1">
+      <w:start w:val="1"/>
+      <w:numFmt w:val="bullet"/>
+      <w:lvlText w:val=""/>
+      <w:lvlJc w:val="left"/>
+      <w:pPr>
+        <w:ind w:left="4320" w:hanging="360"/>
+      </w:pPr>
+      <w:rPr>
+        <w:rFonts w:ascii="Wingdings" w:hAnsi="Wingdings" w:hint="default"/>
+      </w:rPr>
+    </w:lvl>
+    <w:lvl w:ilvl="6" w:tplc="08090001" w:tentative="1">
+      <w:start w:val="1"/>
+      <w:numFmt w:val="bullet"/>
+      <w:lvlText w:val=""/>
+      <w:lvlJc w:val="left"/>
+      <w:pPr>
+        <w:ind w:left="5040" w:hanging="360"/>
+      </w:pPr>
+      <w:rPr>
+        <w:rFonts w:ascii="Symbol" w:hAnsi="Symbol" w:hint="default"/>
+      </w:rPr>
+    </w:lvl>
+    <w:lvl w:ilvl="7" w:tplc="08090003" w:tentative="1">
+      <w:start w:val="1"/>
+      <w:numFmt w:val="bullet"/>
+      <w:lvlText w:val="o"/>
+      <w:lvlJc w:val="left"/>
+      <w:pPr>
+        <w:ind w:left="5760" w:hanging="360"/>
+      </w:pPr>
+      <w:rPr>
+        <w:rFonts w:ascii="Courier New" w:hAnsi="Courier New" w:hint="default"/>
+      </w:rPr>
+    </w:lvl>
+    <w:lvl w:ilvl="8" w:tplc="08090005" w:tentative="1">
+      <w:start w:val="1"/>
+      <w:numFmt w:val="bullet"/>
+      <w:lvlText w:val=""/>
+      <w:lvlJc w:val="left"/>
+      <w:pPr>
+        <w:ind w:left="6480" w:hanging="360"/>
+      </w:pPr>
+      <w:rPr>
+        <w:rFonts w:ascii="Wingdings" w:hAnsi="Wingdings" w:hint="default"/>
+      </w:rPr>
+    </w:lvl>
+  </w:abstractNum>
+  <w:abstractNum w:abstractNumId="2" w15:restartNumberingAfterBreak="0">
     <w:nsid w:val="09C91632"/>
     <w:multiLevelType w:val="hybridMultilevel"/>
     <w:tmpl w:val="13DAFE9A"/>
@@ -6398,7 +7348,7 @@
       </w:pPr>
     </w:lvl>
   </w:abstractNum>
-  <w:abstractNum w:abstractNumId="1" w15:restartNumberingAfterBreak="0">
+  <w:abstractNum w:abstractNumId="3" w15:restartNumberingAfterBreak="0">
     <w:nsid w:val="215B5F57"/>
     <w:multiLevelType w:val="hybridMultilevel"/>
     <w:tmpl w:val="A3B0054A"/>
@@ -6511,7 +7461,7 @@
       </w:rPr>
     </w:lvl>
   </w:abstractNum>
-  <w:abstractNum w:abstractNumId="2" w15:restartNumberingAfterBreak="0">
+  <w:abstractNum w:abstractNumId="4" w15:restartNumberingAfterBreak="0">
     <w:nsid w:val="2E077A91"/>
     <w:multiLevelType w:val="multilevel"/>
     <w:tmpl w:val="DCB80CFC"/>
@@ -6624,7 +7574,233 @@
       </w:rPr>
     </w:lvl>
   </w:abstractNum>
-  <w:abstractNum w:abstractNumId="3" w15:restartNumberingAfterBreak="0">
+  <w:abstractNum w:abstractNumId="5" w15:restartNumberingAfterBreak="0">
+    <w:nsid w:val="41687E35"/>
+    <w:multiLevelType w:val="hybridMultilevel"/>
+    <w:tmpl w:val="52C25576"/>
+    <w:lvl w:ilvl="0" w:tplc="DF9E3C08">
+      <w:start w:val="1"/>
+      <w:numFmt w:val="bullet"/>
+      <w:lvlText w:val="-"/>
+      <w:lvlJc w:val="left"/>
+      <w:pPr>
+        <w:ind w:left="720" w:hanging="360"/>
+      </w:pPr>
+      <w:rPr>
+        <w:rFonts w:ascii="Times New Roman" w:eastAsia="Times New Roman" w:hAnsi="Times New Roman" w:cs="Times New Roman" w:hint="default"/>
+      </w:rPr>
+    </w:lvl>
+    <w:lvl w:ilvl="1" w:tplc="08090003" w:tentative="1">
+      <w:start w:val="1"/>
+      <w:numFmt w:val="bullet"/>
+      <w:lvlText w:val="o"/>
+      <w:lvlJc w:val="left"/>
+      <w:pPr>
+        <w:ind w:left="1440" w:hanging="360"/>
+      </w:pPr>
+      <w:rPr>
+        <w:rFonts w:ascii="Courier New" w:hAnsi="Courier New" w:hint="default"/>
+      </w:rPr>
+    </w:lvl>
+    <w:lvl w:ilvl="2" w:tplc="08090005" w:tentative="1">
+      <w:start w:val="1"/>
+      <w:numFmt w:val="bullet"/>
+      <w:lvlText w:val=""/>
+      <w:lvlJc w:val="left"/>
+      <w:pPr>
+        <w:ind w:left="2160" w:hanging="360"/>
+      </w:pPr>
+      <w:rPr>
+        <w:rFonts w:ascii="Wingdings" w:hAnsi="Wingdings" w:hint="default"/>
+      </w:rPr>
+    </w:lvl>
+    <w:lvl w:ilvl="3" w:tplc="08090001" w:tentative="1">
+      <w:start w:val="1"/>
+      <w:numFmt w:val="bullet"/>
+      <w:lvlText w:val=""/>
+      <w:lvlJc w:val="left"/>
+      <w:pPr>
+        <w:ind w:left="2880" w:hanging="360"/>
+      </w:pPr>
+      <w:rPr>
+        <w:rFonts w:ascii="Symbol" w:hAnsi="Symbol" w:hint="default"/>
+      </w:rPr>
+    </w:lvl>
+    <w:lvl w:ilvl="4" w:tplc="08090003" w:tentative="1">
+      <w:start w:val="1"/>
+      <w:numFmt w:val="bullet"/>
+      <w:lvlText w:val="o"/>
+      <w:lvlJc w:val="left"/>
+      <w:pPr>
+        <w:ind w:left="3600" w:hanging="360"/>
+      </w:pPr>
+      <w:rPr>
+        <w:rFonts w:ascii="Courier New" w:hAnsi="Courier New" w:hint="default"/>
+      </w:rPr>
+    </w:lvl>
+    <w:lvl w:ilvl="5" w:tplc="08090005" w:tentative="1">
+      <w:start w:val="1"/>
+      <w:numFmt w:val="bullet"/>
+      <w:lvlText w:val=""/>
+      <w:lvlJc w:val="left"/>
+      <w:pPr>
+        <w:ind w:left="4320" w:hanging="360"/>
+      </w:pPr>
+      <w:rPr>
+        <w:rFonts w:ascii="Wingdings" w:hAnsi="Wingdings" w:hint="default"/>
+      </w:rPr>
+    </w:lvl>
+    <w:lvl w:ilvl="6" w:tplc="08090001" w:tentative="1">
+      <w:start w:val="1"/>
+      <w:numFmt w:val="bullet"/>
+      <w:lvlText w:val=""/>
+      <w:lvlJc w:val="left"/>
+      <w:pPr>
+        <w:ind w:left="5040" w:hanging="360"/>
+      </w:pPr>
+      <w:rPr>
+        <w:rFonts w:ascii="Symbol" w:hAnsi="Symbol" w:hint="default"/>
+      </w:rPr>
+    </w:lvl>
+    <w:lvl w:ilvl="7" w:tplc="08090003" w:tentative="1">
+      <w:start w:val="1"/>
+      <w:numFmt w:val="bullet"/>
+      <w:lvlText w:val="o"/>
+      <w:lvlJc w:val="left"/>
+      <w:pPr>
+        <w:ind w:left="5760" w:hanging="360"/>
+      </w:pPr>
+      <w:rPr>
+        <w:rFonts w:ascii="Courier New" w:hAnsi="Courier New" w:hint="default"/>
+      </w:rPr>
+    </w:lvl>
+    <w:lvl w:ilvl="8" w:tplc="08090005" w:tentative="1">
+      <w:start w:val="1"/>
+      <w:numFmt w:val="bullet"/>
+      <w:lvlText w:val=""/>
+      <w:lvlJc w:val="left"/>
+      <w:pPr>
+        <w:ind w:left="6480" w:hanging="360"/>
+      </w:pPr>
+      <w:rPr>
+        <w:rFonts w:ascii="Wingdings" w:hAnsi="Wingdings" w:hint="default"/>
+      </w:rPr>
+    </w:lvl>
+  </w:abstractNum>
+  <w:abstractNum w:abstractNumId="6" w15:restartNumberingAfterBreak="0">
+    <w:nsid w:val="43CC3AF3"/>
+    <w:multiLevelType w:val="hybridMultilevel"/>
+    <w:tmpl w:val="6B503D5C"/>
+    <w:lvl w:ilvl="0" w:tplc="08090001">
+      <w:start w:val="1"/>
+      <w:numFmt w:val="bullet"/>
+      <w:lvlText w:val=""/>
+      <w:lvlJc w:val="left"/>
+      <w:pPr>
+        <w:ind w:left="720" w:hanging="360"/>
+      </w:pPr>
+      <w:rPr>
+        <w:rFonts w:ascii="Symbol" w:hAnsi="Symbol" w:hint="default"/>
+      </w:rPr>
+    </w:lvl>
+    <w:lvl w:ilvl="1" w:tplc="08090003" w:tentative="1">
+      <w:start w:val="1"/>
+      <w:numFmt w:val="bullet"/>
+      <w:lvlText w:val="o"/>
+      <w:lvlJc w:val="left"/>
+      <w:pPr>
+        <w:ind w:left="1440" w:hanging="360"/>
+      </w:pPr>
+      <w:rPr>
+        <w:rFonts w:ascii="Courier New" w:hAnsi="Courier New" w:hint="default"/>
+      </w:rPr>
+    </w:lvl>
+    <w:lvl w:ilvl="2" w:tplc="08090005" w:tentative="1">
+      <w:start w:val="1"/>
+      <w:numFmt w:val="bullet"/>
+      <w:lvlText w:val=""/>
+      <w:lvlJc w:val="left"/>
+      <w:pPr>
+        <w:ind w:left="2160" w:hanging="360"/>
+      </w:pPr>
+      <w:rPr>
+        <w:rFonts w:ascii="Wingdings" w:hAnsi="Wingdings" w:hint="default"/>
+      </w:rPr>
+    </w:lvl>
+    <w:lvl w:ilvl="3" w:tplc="08090001" w:tentative="1">
+      <w:start w:val="1"/>
+      <w:numFmt w:val="bullet"/>
+      <w:lvlText w:val=""/>
+      <w:lvlJc w:val="left"/>
+      <w:pPr>
+        <w:ind w:left="2880" w:hanging="360"/>
+      </w:pPr>
+      <w:rPr>
+        <w:rFonts w:ascii="Symbol" w:hAnsi="Symbol" w:hint="default"/>
+      </w:rPr>
+    </w:lvl>
+    <w:lvl w:ilvl="4" w:tplc="08090003" w:tentative="1">
+      <w:start w:val="1"/>
+      <w:numFmt w:val="bullet"/>
+      <w:lvlText w:val="o"/>
+      <w:lvlJc w:val="left"/>
+      <w:pPr>
+        <w:ind w:left="3600" w:hanging="360"/>
+      </w:pPr>
+      <w:rPr>
+        <w:rFonts w:ascii="Courier New" w:hAnsi="Courier New" w:hint="default"/>
+      </w:rPr>
+    </w:lvl>
+    <w:lvl w:ilvl="5" w:tplc="08090005" w:tentative="1">
+      <w:start w:val="1"/>
+      <w:numFmt w:val="bullet"/>
+      <w:lvlText w:val=""/>
+      <w:lvlJc w:val="left"/>
+      <w:pPr>
+        <w:ind w:left="4320" w:hanging="360"/>
+      </w:pPr>
+      <w:rPr>
+        <w:rFonts w:ascii="Wingdings" w:hAnsi="Wingdings" w:hint="default"/>
+      </w:rPr>
+    </w:lvl>
+    <w:lvl w:ilvl="6" w:tplc="08090001" w:tentative="1">
+      <w:start w:val="1"/>
+      <w:numFmt w:val="bullet"/>
+      <w:lvlText w:val=""/>
+      <w:lvlJc w:val="left"/>
+      <w:pPr>
+        <w:ind w:left="5040" w:hanging="360"/>
+      </w:pPr>
+      <w:rPr>
+        <w:rFonts w:ascii="Symbol" w:hAnsi="Symbol" w:hint="default"/>
+      </w:rPr>
+    </w:lvl>
+    <w:lvl w:ilvl="7" w:tplc="08090003" w:tentative="1">
+      <w:start w:val="1"/>
+      <w:numFmt w:val="bullet"/>
+      <w:lvlText w:val="o"/>
+      <w:lvlJc w:val="left"/>
+      <w:pPr>
+        <w:ind w:left="5760" w:hanging="360"/>
+      </w:pPr>
+      <w:rPr>
+        <w:rFonts w:ascii="Courier New" w:hAnsi="Courier New" w:hint="default"/>
+      </w:rPr>
+    </w:lvl>
+    <w:lvl w:ilvl="8" w:tplc="08090005" w:tentative="1">
+      <w:start w:val="1"/>
+      <w:numFmt w:val="bullet"/>
+      <w:lvlText w:val=""/>
+      <w:lvlJc w:val="left"/>
+      <w:pPr>
+        <w:ind w:left="6480" w:hanging="360"/>
+      </w:pPr>
+      <w:rPr>
+        <w:rFonts w:ascii="Wingdings" w:hAnsi="Wingdings" w:hint="default"/>
+      </w:rPr>
+    </w:lvl>
+  </w:abstractNum>
+  <w:abstractNum w:abstractNumId="7" w15:restartNumberingAfterBreak="0">
     <w:nsid w:val="4B891CE9"/>
     <w:multiLevelType w:val="multilevel"/>
     <w:tmpl w:val="46A825BE"/>
@@ -6737,7 +7913,7 @@
       </w:rPr>
     </w:lvl>
   </w:abstractNum>
-  <w:abstractNum w:abstractNumId="4" w15:restartNumberingAfterBreak="0">
+  <w:abstractNum w:abstractNumId="8" w15:restartNumberingAfterBreak="0">
     <w:nsid w:val="4ED50807"/>
     <w:multiLevelType w:val="multilevel"/>
     <w:tmpl w:val="E2B4D3F4"/>
@@ -6823,7 +7999,7 @@
       </w:pPr>
     </w:lvl>
   </w:abstractNum>
-  <w:abstractNum w:abstractNumId="5" w15:restartNumberingAfterBreak="0">
+  <w:abstractNum w:abstractNumId="9" w15:restartNumberingAfterBreak="0">
     <w:nsid w:val="52A55559"/>
     <w:multiLevelType w:val="hybridMultilevel"/>
     <w:tmpl w:val="18F866BE"/>
@@ -6936,7 +8112,120 @@
       </w:rPr>
     </w:lvl>
   </w:abstractNum>
-  <w:abstractNum w:abstractNumId="6" w15:restartNumberingAfterBreak="0">
+  <w:abstractNum w:abstractNumId="10" w15:restartNumberingAfterBreak="0">
+    <w:nsid w:val="62E539B5"/>
+    <w:multiLevelType w:val="hybridMultilevel"/>
+    <w:tmpl w:val="601A5CA4"/>
+    <w:lvl w:ilvl="0" w:tplc="08090001">
+      <w:start w:val="1"/>
+      <w:numFmt w:val="bullet"/>
+      <w:lvlText w:val=""/>
+      <w:lvlJc w:val="left"/>
+      <w:pPr>
+        <w:ind w:left="720" w:hanging="360"/>
+      </w:pPr>
+      <w:rPr>
+        <w:rFonts w:ascii="Symbol" w:hAnsi="Symbol" w:hint="default"/>
+      </w:rPr>
+    </w:lvl>
+    <w:lvl w:ilvl="1" w:tplc="08090003" w:tentative="1">
+      <w:start w:val="1"/>
+      <w:numFmt w:val="bullet"/>
+      <w:lvlText w:val="o"/>
+      <w:lvlJc w:val="left"/>
+      <w:pPr>
+        <w:ind w:left="1440" w:hanging="360"/>
+      </w:pPr>
+      <w:rPr>
+        <w:rFonts w:ascii="Courier New" w:hAnsi="Courier New" w:hint="default"/>
+      </w:rPr>
+    </w:lvl>
+    <w:lvl w:ilvl="2" w:tplc="08090005" w:tentative="1">
+      <w:start w:val="1"/>
+      <w:numFmt w:val="bullet"/>
+      <w:lvlText w:val=""/>
+      <w:lvlJc w:val="left"/>
+      <w:pPr>
+        <w:ind w:left="2160" w:hanging="360"/>
+      </w:pPr>
+      <w:rPr>
+        <w:rFonts w:ascii="Wingdings" w:hAnsi="Wingdings" w:hint="default"/>
+      </w:rPr>
+    </w:lvl>
+    <w:lvl w:ilvl="3" w:tplc="08090001" w:tentative="1">
+      <w:start w:val="1"/>
+      <w:numFmt w:val="bullet"/>
+      <w:lvlText w:val=""/>
+      <w:lvlJc w:val="left"/>
+      <w:pPr>
+        <w:ind w:left="2880" w:hanging="360"/>
+      </w:pPr>
+      <w:rPr>
+        <w:rFonts w:ascii="Symbol" w:hAnsi="Symbol" w:hint="default"/>
+      </w:rPr>
+    </w:lvl>
+    <w:lvl w:ilvl="4" w:tplc="08090003" w:tentative="1">
+      <w:start w:val="1"/>
+      <w:numFmt w:val="bullet"/>
+      <w:lvlText w:val="o"/>
+      <w:lvlJc w:val="left"/>
+      <w:pPr>
+        <w:ind w:left="3600" w:hanging="360"/>
+      </w:pPr>
+      <w:rPr>
+        <w:rFonts w:ascii="Courier New" w:hAnsi="Courier New" w:hint="default"/>
+      </w:rPr>
+    </w:lvl>
+    <w:lvl w:ilvl="5" w:tplc="08090005" w:tentative="1">
+      <w:start w:val="1"/>
+      <w:numFmt w:val="bullet"/>
+      <w:lvlText w:val=""/>
+      <w:lvlJc w:val="left"/>
+      <w:pPr>
+        <w:ind w:left="4320" w:hanging="360"/>
+      </w:pPr>
+      <w:rPr>
+        <w:rFonts w:ascii="Wingdings" w:hAnsi="Wingdings" w:hint="default"/>
+      </w:rPr>
+    </w:lvl>
+    <w:lvl w:ilvl="6" w:tplc="08090001" w:tentative="1">
+      <w:start w:val="1"/>
+      <w:numFmt w:val="bullet"/>
+      <w:lvlText w:val=""/>
+      <w:lvlJc w:val="left"/>
+      <w:pPr>
+        <w:ind w:left="5040" w:hanging="360"/>
+      </w:pPr>
+      <w:rPr>
+        <w:rFonts w:ascii="Symbol" w:hAnsi="Symbol" w:hint="default"/>
+      </w:rPr>
+    </w:lvl>
+    <w:lvl w:ilvl="7" w:tplc="08090003" w:tentative="1">
+      <w:start w:val="1"/>
+      <w:numFmt w:val="bullet"/>
+      <w:lvlText w:val="o"/>
+      <w:lvlJc w:val="left"/>
+      <w:pPr>
+        <w:ind w:left="5760" w:hanging="360"/>
+      </w:pPr>
+      <w:rPr>
+        <w:rFonts w:ascii="Courier New" w:hAnsi="Courier New" w:hint="default"/>
+      </w:rPr>
+    </w:lvl>
+    <w:lvl w:ilvl="8" w:tplc="08090005" w:tentative="1">
+      <w:start w:val="1"/>
+      <w:numFmt w:val="bullet"/>
+      <w:lvlText w:val=""/>
+      <w:lvlJc w:val="left"/>
+      <w:pPr>
+        <w:ind w:left="6480" w:hanging="360"/>
+      </w:pPr>
+      <w:rPr>
+        <w:rFonts w:ascii="Wingdings" w:hAnsi="Wingdings" w:hint="default"/>
+      </w:rPr>
+    </w:lvl>
+  </w:abstractNum>
+  <w:abstractNum w:abstractNumId="11" w15:restartNumberingAfterBreak="0">
     <w:nsid w:val="70584135"/>
     <w:multiLevelType w:val="multilevel"/>
     <w:tmpl w:val="32D0D818"/>
@@ -7029,7 +8318,7 @@
       </w:pPr>
     </w:lvl>
   </w:abstractNum>
-  <w:abstractNum w:abstractNumId="7" w15:restartNumberingAfterBreak="0">
+  <w:abstractNum w:abstractNumId="12" w15:restartNumberingAfterBreak="0">
     <w:nsid w:val="7584165E"/>
     <w:multiLevelType w:val="multilevel"/>
     <w:tmpl w:val="709C82F4"/>
@@ -7150,17 +8439,130 @@
       </w:rPr>
     </w:lvl>
   </w:abstractNum>
+  <w:abstractNum w:abstractNumId="13" w15:restartNumberingAfterBreak="0">
+    <w:nsid w:val="79870803"/>
+    <w:multiLevelType w:val="hybridMultilevel"/>
+    <w:tmpl w:val="290282AE"/>
+    <w:lvl w:ilvl="0" w:tplc="08090001">
+      <w:start w:val="1"/>
+      <w:numFmt w:val="bullet"/>
+      <w:lvlText w:val=""/>
+      <w:lvlJc w:val="left"/>
+      <w:pPr>
+        <w:ind w:left="720" w:hanging="360"/>
+      </w:pPr>
+      <w:rPr>
+        <w:rFonts w:ascii="Symbol" w:hAnsi="Symbol" w:hint="default"/>
+      </w:rPr>
+    </w:lvl>
+    <w:lvl w:ilvl="1" w:tplc="08090003" w:tentative="1">
+      <w:start w:val="1"/>
+      <w:numFmt w:val="bullet"/>
+      <w:lvlText w:val="o"/>
+      <w:lvlJc w:val="left"/>
+      <w:pPr>
+        <w:ind w:left="1440" w:hanging="360"/>
+      </w:pPr>
+      <w:rPr>
+        <w:rFonts w:ascii="Courier New" w:hAnsi="Courier New" w:hint="default"/>
+      </w:rPr>
+    </w:lvl>
+    <w:lvl w:ilvl="2" w:tplc="08090005" w:tentative="1">
+      <w:start w:val="1"/>
+      <w:numFmt w:val="bullet"/>
+      <w:lvlText w:val=""/>
+      <w:lvlJc w:val="left"/>
+      <w:pPr>
+        <w:ind w:left="2160" w:hanging="360"/>
+      </w:pPr>
+      <w:rPr>
+        <w:rFonts w:ascii="Wingdings" w:hAnsi="Wingdings" w:hint="default"/>
+      </w:rPr>
+    </w:lvl>
+    <w:lvl w:ilvl="3" w:tplc="08090001" w:tentative="1">
+      <w:start w:val="1"/>
+      <w:numFmt w:val="bullet"/>
+      <w:lvlText w:val=""/>
+      <w:lvlJc w:val="left"/>
+      <w:pPr>
+        <w:ind w:left="2880" w:hanging="360"/>
+      </w:pPr>
+      <w:rPr>
+        <w:rFonts w:ascii="Symbol" w:hAnsi="Symbol" w:hint="default"/>
+      </w:rPr>
+    </w:lvl>
+    <w:lvl w:ilvl="4" w:tplc="08090003" w:tentative="1">
+      <w:start w:val="1"/>
+      <w:numFmt w:val="bullet"/>
+      <w:lvlText w:val="o"/>
+      <w:lvlJc w:val="left"/>
+      <w:pPr>
+        <w:ind w:left="3600" w:hanging="360"/>
+      </w:pPr>
+      <w:rPr>
+        <w:rFonts w:ascii="Courier New" w:hAnsi="Courier New" w:hint="default"/>
+      </w:rPr>
+    </w:lvl>
+    <w:lvl w:ilvl="5" w:tplc="08090005" w:tentative="1">
+      <w:start w:val="1"/>
+      <w:numFmt w:val="bullet"/>
+      <w:lvlText w:val=""/>
+      <w:lvlJc w:val="left"/>
+      <w:pPr>
+        <w:ind w:left="4320" w:hanging="360"/>
+      </w:pPr>
+      <w:rPr>
+        <w:rFonts w:ascii="Wingdings" w:hAnsi="Wingdings" w:hint="default"/>
+      </w:rPr>
+    </w:lvl>
+    <w:lvl w:ilvl="6" w:tplc="08090001" w:tentative="1">
+      <w:start w:val="1"/>
+      <w:numFmt w:val="bullet"/>
+      <w:lvlText w:val=""/>
+      <w:lvlJc w:val="left"/>
+      <w:pPr>
+        <w:ind w:left="5040" w:hanging="360"/>
+      </w:pPr>
+      <w:rPr>
+        <w:rFonts w:ascii="Symbol" w:hAnsi="Symbol" w:hint="default"/>
+      </w:rPr>
+    </w:lvl>
+    <w:lvl w:ilvl="7" w:tplc="08090003" w:tentative="1">
+      <w:start w:val="1"/>
+      <w:numFmt w:val="bullet"/>
+      <w:lvlText w:val="o"/>
+      <w:lvlJc w:val="left"/>
+      <w:pPr>
+        <w:ind w:left="5760" w:hanging="360"/>
+      </w:pPr>
+      <w:rPr>
+        <w:rFonts w:ascii="Courier New" w:hAnsi="Courier New" w:hint="default"/>
+      </w:rPr>
+    </w:lvl>
+    <w:lvl w:ilvl="8" w:tplc="08090005" w:tentative="1">
+      <w:start w:val="1"/>
+      <w:numFmt w:val="bullet"/>
+      <w:lvlText w:val=""/>
+      <w:lvlJc w:val="left"/>
+      <w:pPr>
+        <w:ind w:left="6480" w:hanging="360"/>
+      </w:pPr>
+      <w:rPr>
+        <w:rFonts w:ascii="Wingdings" w:hAnsi="Wingdings" w:hint="default"/>
+      </w:rPr>
+    </w:lvl>
+  </w:abstractNum>
   <w:num w:numId="1" w16cid:durableId="46345011">
-    <w:abstractNumId w:val="7"/>
+    <w:abstractNumId w:val="12"/>
   </w:num>
   <w:num w:numId="2" w16cid:durableId="1251543669">
-    <w:abstractNumId w:val="4"/>
+    <w:abstractNumId w:val="8"/>
   </w:num>
   <w:num w:numId="3" w16cid:durableId="1577783473">
-    <w:abstractNumId w:val="7"/>
+    <w:abstractNumId w:val="12"/>
   </w:num>
   <w:num w:numId="4" w16cid:durableId="243270084">
-    <w:abstractNumId w:val="7"/>
+    <w:abstractNumId w:val="12"/>
     <w:lvlOverride w:ilvl="0">
       <w:startOverride w:val="1"/>
     </w:lvlOverride>
@@ -7190,13 +8592,13 @@
     </w:lvlOverride>
   </w:num>
   <w:num w:numId="5" w16cid:durableId="1629051039">
-    <w:abstractNumId w:val="0"/>
+    <w:abstractNumId w:val="2"/>
   </w:num>
   <w:num w:numId="6" w16cid:durableId="1541160927">
-    <w:abstractNumId w:val="6"/>
+    <w:abstractNumId w:val="11"/>
   </w:num>
   <w:num w:numId="7" w16cid:durableId="18047303">
-    <w:abstractNumId w:val="7"/>
+    <w:abstractNumId w:val="12"/>
     <w:lvlOverride w:ilvl="0">
       <w:startOverride w:val="1"/>
     </w:lvlOverride>
@@ -7226,16 +8628,34 @@
     </w:lvlOverride>
   </w:num>
   <w:num w:numId="8" w16cid:durableId="1360280844">
-    <w:abstractNumId w:val="2"/>
+    <w:abstractNumId w:val="4"/>
   </w:num>
   <w:num w:numId="9" w16cid:durableId="1835993045">
+    <w:abstractNumId w:val="3"/>
+  </w:num>
+  <w:num w:numId="10" w16cid:durableId="1990358569">
+    <w:abstractNumId w:val="9"/>
+  </w:num>
+  <w:num w:numId="11" w16cid:durableId="536549302">
+    <w:abstractNumId w:val="7"/>
+  </w:num>
+  <w:num w:numId="12" w16cid:durableId="1950432740">
     <w:abstractNumId w:val="1"/>
   </w:num>
-  <w:num w:numId="10" w16cid:durableId="1990358569">
+  <w:num w:numId="13" w16cid:durableId="1388989691">
     <w:abstractNumId w:val="5"/>
   </w:num>
-  <w:num w:numId="11" w16cid:durableId="536549302">
-    <w:abstractNumId w:val="3"/>
+  <w:num w:numId="14" w16cid:durableId="1861429359">
+    <w:abstractNumId w:val="10"/>
+  </w:num>
+  <w:num w:numId="15" w16cid:durableId="243732659">
+    <w:abstractNumId w:val="6"/>
+  </w:num>
+  <w:num w:numId="16" w16cid:durableId="2013948257">
+    <w:abstractNumId w:val="0"/>
+  </w:num>
+  <w:num w:numId="17" w16cid:durableId="1250774974">
+    <w:abstractNumId w:val="13"/>
   </w:num>
 </w:numbering>
 </file>
@@ -7859,15 +9279,13 @@
   <w:style w:type="character" w:default="1" w:styleId="DefaultParagraphFont">
     <w:name w:val="Default Paragraph Font"/>
     <w:uiPriority w:val="1"/>
+    <w:semiHidden/>
     <w:unhideWhenUsed/>
-    <w:rsid w:val="00A9512D"/>
-    <w:rPr>
-      <w:rFonts w:ascii="Times New Roman" w:hAnsi="Times New Roman"/>
-    </w:rPr>
   </w:style>
   <w:style w:type="table" w:default="1" w:styleId="TableNormal">
     <w:name w:val="Normal Table"/>
     <w:uiPriority w:val="99"/>
+    <w:semiHidden/>
     <w:unhideWhenUsed/>
     <w:tblPr>
       <w:tblInd w:w="0" w:type="dxa"/>

</xml_diff>

<commit_message>
Sprint 01: Worked on CRISP-DM and summaries for EOY report
</commit_message>
<xml_diff>
--- a/crisp-dm/aeroq-crisp-dm.docx
+++ b/crisp-dm/aeroq-crisp-dm.docx
@@ -3664,59 +3664,94 @@
         <w:t>.</w:t>
       </w:r>
       <w:r>
+        <w:t xml:space="preserve"> To provide </w:t>
+      </w:r>
+      <w:r>
+        <w:t>my overview</w:t>
+      </w:r>
+      <w:r>
+        <w:t>, I will discuss a</w:t>
+      </w:r>
+      <w:r>
+        <w:t>n</w:t>
+      </w:r>
+      <w:r>
+        <w:t xml:space="preserve"> industry</w:t>
+      </w:r>
+      <w:r>
+        <w:t xml:space="preserve"> stalwart</w:t>
+      </w:r>
+      <w:r>
+        <w:t xml:space="preserve">, </w:t>
+      </w:r>
+      <w:r>
+        <w:t>TripIt</w:t>
+      </w:r>
+      <w:r>
+        <w:t xml:space="preserve">, a </w:t>
+      </w:r>
+      <w:r>
+        <w:t>breakout success</w:t>
+      </w:r>
+      <w:r>
+        <w:t xml:space="preserve">, </w:t>
+      </w:r>
+      <w:r>
+        <w:t>Flighty</w:t>
+      </w:r>
+      <w:r>
+        <w:t xml:space="preserve">, and </w:t>
+      </w:r>
+      <w:r>
+        <w:t>the now defunct App in the Air.</w:t>
+      </w:r>
+    </w:p>
+    <w:p/>
+    <w:p>
+      <w:pPr>
+        <w:pStyle w:val="Heading5"/>
+      </w:pPr>
+      <w:r>
+        <w:t>Flighty</w:t>
+      </w:r>
+    </w:p>
+    <w:p>
+      <w:r>
+        <w:t xml:space="preserve">Launched on 19/08/2019 by a team of three developers, </w:t>
+      </w:r>
+      <w:r>
+        <w:t>Flighty</w:t>
+      </w:r>
+      <w:r>
+        <w:t xml:space="preserve"> has since emerged among the market leaders and</w:t>
+      </w:r>
+      <w:r>
+        <w:t xml:space="preserve"> was awarded the </w:t>
+      </w:r>
+      <w:r>
+        <w:t xml:space="preserve">2023 </w:t>
+      </w:r>
+      <w:r>
+        <w:t>Apple Design Award</w:t>
+      </w:r>
+      <w:r>
+        <w:t xml:space="preserve">. </w:t>
+      </w:r>
+      <w:r>
+        <w:t>The company reports millions of active users</w:t>
+      </w:r>
+      <w:r>
+        <w:t xml:space="preserve"> across the world and holds </w:t>
+      </w:r>
+      <w:r>
+        <w:t>a 4.7 out of 5 average rating on the Irish iOS App Store (as of 10/10/2026).</w:t>
+      </w:r>
+      <w:r>
         <w:t xml:space="preserve"> </w:t>
       </w:r>
-    </w:p>
-    <w:p/>
-    <w:p>
-      <w:pPr>
-        <w:pStyle w:val="Heading5"/>
-      </w:pPr>
-      <w:r>
-        <w:t>Flightly</w:t>
-      </w:r>
-    </w:p>
-    <w:p>
-      <w:r>
-        <w:t xml:space="preserve">Launched on 19/08/2019 by a team of three developers, </w:t>
-      </w:r>
-      <w:proofErr w:type="spellStart"/>
-      <w:r>
-        <w:t>Flightly</w:t>
-      </w:r>
-      <w:proofErr w:type="spellEnd"/>
-      <w:r>
-        <w:t xml:space="preserve"> has since emerged among the market leaders and</w:t>
-      </w:r>
-      <w:r>
-        <w:t xml:space="preserve"> was awarded the </w:t>
-      </w:r>
-      <w:r>
-        <w:t xml:space="preserve">2023 </w:t>
-      </w:r>
-      <w:r>
-        <w:t>Apple Design Award</w:t>
-      </w:r>
-      <w:r>
-        <w:t xml:space="preserve">. </w:t>
-      </w:r>
-      <w:r>
-        <w:t>The company reports millions of active users</w:t>
-      </w:r>
-      <w:r>
-        <w:t xml:space="preserve"> across the world and holds </w:t>
-      </w:r>
-      <w:r>
-        <w:t>a 4.7 out of 5 average rating on the Irish iOS App Store (as of 10/10/2026).</w:t>
-      </w:r>
-      <w:r>
-        <w:t xml:space="preserve"> </w:t>
-      </w:r>
-      <w:proofErr w:type="spellStart"/>
-      <w:r>
-        <w:t>Flightly</w:t>
-      </w:r>
-      <w:proofErr w:type="spellEnd"/>
+      <w:r>
+        <w:t>Flighty</w:t>
+      </w:r>
       <w:r>
         <w:t xml:space="preserve"> differentiators include the incorporation of airport taxi times, the use of ground and proximity radar data in their predictions, flight gate predictions, sharing of data with friends/family, and a user-friendly summary of their delay prediction, something they call </w:t>
       </w:r>
@@ -3944,7 +3979,19 @@
         <w:rPr>
           <w:lang w:val="en-GB"/>
         </w:rPr>
-        <w:t xml:space="preserve"> intelligence, and </w:t>
+        <w:t xml:space="preserve"> intelligence</w:t>
+      </w:r>
+      <w:r>
+        <w:rPr>
+          <w:lang w:val="en-GB"/>
+        </w:rPr>
+        <w:t xml:space="preserve"> reports</w:t>
+      </w:r>
+      <w:r>
+        <w:rPr>
+          <w:lang w:val="en-GB"/>
+        </w:rPr>
+        <w:t xml:space="preserve">, and </w:t>
       </w:r>
       <w:r>
         <w:rPr>
@@ -4036,30 +4083,358 @@
           <w:lang w:val="en-GB"/>
         </w:rPr>
       </w:pPr>
-      <w:r>
+      <w:hyperlink r:id="rId13" w:history="1">
+        <w:r>
+          <w:rPr>
+            <w:rStyle w:val="Hyperlink"/>
+            <w:lang w:val="en-GB"/>
+          </w:rPr>
+          <w:t>https://www.tripit.com/web/blog/news-culture/5-things-travel-safety-risk</w:t>
+        </w:r>
+      </w:hyperlink>
+    </w:p>
+    <w:p>
+      <w:pPr>
         <w:rPr>
           <w:lang w:val="en-GB"/>
         </w:rPr>
-        <w:t>https://www.tripit.com/web/blog/news-culture/5-things-travel-safety-risk</w:t>
-      </w:r>
-    </w:p>
+      </w:pPr>
+    </w:p>
+    <w:p>
+      <w:pPr>
+        <w:rPr>
+          <w:lang w:val="en-GB"/>
+        </w:rPr>
+      </w:pPr>
+    </w:p>
+    <w:p>
+      <w:pPr>
+        <w:rPr>
+          <w:lang w:val="en-GB"/>
+        </w:rPr>
+      </w:pPr>
+    </w:p>
+    <w:p>
+      <w:pPr>
+        <w:pStyle w:val="Heading5"/>
+      </w:pPr>
+      <w:r>
+        <w:lastRenderedPageBreak/>
+        <w:t>App in the Air</w:t>
+      </w:r>
+    </w:p>
+    <w:p>
+      <w:r>
+        <w:t>Released</w:t>
+      </w:r>
+      <w:r>
+        <w:t xml:space="preserve"> in 2012, </w:t>
+      </w:r>
+      <w:r>
+        <w:t>App in the Air</w:t>
+      </w:r>
+      <w:r>
+        <w:t xml:space="preserve"> offered streamlined flight tracking and delay prediction,</w:t>
+      </w:r>
+      <w:r>
+        <w:t xml:space="preserve"> reporting</w:t>
+      </w:r>
+      <w:r>
+        <w:t xml:space="preserve"> over 6 million user</w:t>
+      </w:r>
+      <w:r>
+        <w:t>s</w:t>
+      </w:r>
+      <w:r>
+        <w:t xml:space="preserve"> at its peak</w:t>
+      </w:r>
+      <w:r>
+        <w:t xml:space="preserve"> and </w:t>
+      </w:r>
+      <w:r>
+        <w:t>earning</w:t>
+      </w:r>
+      <w:r>
+        <w:t xml:space="preserve"> a place </w:t>
+      </w:r>
+      <w:r>
+        <w:t>on</w:t>
+      </w:r>
+      <w:r>
+        <w:t xml:space="preserve"> </w:t>
+      </w:r>
+      <w:r>
+        <w:t>Apple</w:t>
+      </w:r>
+      <w:r>
+        <w:t>’s list of the</w:t>
+      </w:r>
+      <w:r>
+        <w:t xml:space="preserve"> Best Apps of 2015</w:t>
+      </w:r>
+      <w:r>
+        <w:t xml:space="preserve">. </w:t>
+      </w:r>
+      <w:r>
+        <w:t>The course of App in the Air, however, now serves</w:t>
+      </w:r>
+      <w:r>
+        <w:t xml:space="preserve"> as a reminder that </w:t>
+      </w:r>
+      <w:r>
+        <w:t>failure</w:t>
+      </w:r>
+      <w:r>
+        <w:t xml:space="preserve"> to adapt can threaten survival.</w:t>
+      </w:r>
+      <w:r>
+        <w:t xml:space="preserve"> As competitors like </w:t>
+      </w:r>
+      <w:r>
+        <w:t>Flighty</w:t>
+      </w:r>
+      <w:r>
+        <w:t xml:space="preserve"> and </w:t>
+      </w:r>
+      <w:proofErr w:type="spellStart"/>
+      <w:r>
+        <w:t>Wanderlog</w:t>
+      </w:r>
+      <w:proofErr w:type="spellEnd"/>
+      <w:r>
+        <w:t xml:space="preserve"> </w:t>
+      </w:r>
+      <w:r>
+        <w:t>began</w:t>
+      </w:r>
+      <w:r>
+        <w:t xml:space="preserve"> operations in 2019</w:t>
+      </w:r>
+      <w:r>
+        <w:t xml:space="preserve"> with differentiators like live flight tracking alerts and clean, focused UIs</w:t>
+      </w:r>
+      <w:r>
+        <w:t xml:space="preserve">, </w:t>
+      </w:r>
+      <w:r>
+        <w:t>App in the Air</w:t>
+      </w:r>
+      <w:r>
+        <w:t xml:space="preserve"> </w:t>
+      </w:r>
+      <w:r>
+        <w:t>continued to pursue</w:t>
+      </w:r>
+      <w:r>
+        <w:t xml:space="preserve"> </w:t>
+      </w:r>
+      <w:r>
+        <w:t>feature</w:t>
+      </w:r>
+      <w:r>
+        <w:t xml:space="preserve"> volume:</w:t>
+      </w:r>
+      <w:r>
+        <w:t xml:space="preserve"> airport guides, passenger social </w:t>
+      </w:r>
+      <w:r>
+        <w:t>chats</w:t>
+      </w:r>
+      <w:r>
+        <w:t>, gamified flight logs,</w:t>
+      </w:r>
+      <w:r>
+        <w:t xml:space="preserve"> digital badges,</w:t>
+      </w:r>
+      <w:r>
+        <w:t xml:space="preserve"> travel documents, </w:t>
+      </w:r>
+      <w:proofErr w:type="spellStart"/>
+      <w:r>
+        <w:t>eSIMs</w:t>
+      </w:r>
+      <w:proofErr w:type="spellEnd"/>
+      <w:r>
+        <w:t xml:space="preserve">, carbon </w:t>
+      </w:r>
+      <w:r>
+        <w:t xml:space="preserve">footprint tracking, </w:t>
+      </w:r>
+      <w:r>
+        <w:t>insurance</w:t>
+      </w:r>
+      <w:r>
+        <w:t xml:space="preserve">, </w:t>
+      </w:r>
+      <w:r>
+        <w:t>and AI-assisted booking</w:t>
+      </w:r>
+      <w:r>
+        <w:t xml:space="preserve">. </w:t>
+      </w:r>
+      <w:r>
+        <w:t xml:space="preserve">A feature that I think best exemplifies this sprawl is </w:t>
+      </w:r>
+      <w:r>
+        <w:t xml:space="preserve">an augmented reality (AR) tool to measure </w:t>
+      </w:r>
+      <w:r>
+        <w:t xml:space="preserve">luggage, something which is hard to </w:t>
+      </w:r>
+      <w:r>
+        <w:t xml:space="preserve">reconcile in </w:t>
+      </w:r>
+      <w:r>
+        <w:t xml:space="preserve">an app designed for </w:t>
+      </w:r>
+      <w:r>
+        <w:t xml:space="preserve">“the </w:t>
+      </w:r>
+      <w:r>
+        <w:t>modern frequent flyer</w:t>
+      </w:r>
+      <w:r>
+        <w:t>.</w:t>
+      </w:r>
+      <w:r>
+        <w:t xml:space="preserve">” </w:t>
+      </w:r>
+      <w:r>
+        <w:t>This</w:t>
+      </w:r>
+      <w:r>
+        <w:t xml:space="preserve"> inability to evolve from a status</w:t>
+      </w:r>
+      <w:r>
+        <w:t xml:space="preserve"> </w:t>
+      </w:r>
+      <w:r>
+        <w:t>a</w:t>
+      </w:r>
+      <w:r>
+        <w:t xml:space="preserve">nd </w:t>
+      </w:r>
+      <w:r>
+        <w:t>information app</w:t>
+      </w:r>
+      <w:r>
+        <w:t xml:space="preserve">, alongside </w:t>
+      </w:r>
+      <w:r>
+        <w:t>funding</w:t>
+      </w:r>
+      <w:r>
+        <w:t xml:space="preserve"> issues and</w:t>
+      </w:r>
+      <w:r>
+        <w:t xml:space="preserve"> rising real</w:t>
+      </w:r>
+      <w:r>
+        <w:t xml:space="preserve"> </w:t>
+      </w:r>
+      <w:r>
+        <w:t>time data costs</w:t>
+      </w:r>
+      <w:r>
+        <w:t>, resulted</w:t>
+      </w:r>
+      <w:r>
+        <w:t xml:space="preserve"> in </w:t>
+      </w:r>
+      <w:r>
+        <w:t>App</w:t>
+      </w:r>
+      <w:r>
+        <w:t xml:space="preserve"> in the Air’s</w:t>
+      </w:r>
+      <w:r>
+        <w:t xml:space="preserve"> </w:t>
+      </w:r>
+      <w:r>
+        <w:t>full shutdown on 19/10/2024</w:t>
+      </w:r>
+      <w:r>
+        <w:t>.</w:t>
+      </w:r>
+    </w:p>
+    <w:p/>
+    <w:p>
+      <w:hyperlink r:id="rId14" w:history="1">
+        <w:r>
+          <w:rPr>
+            <w:rStyle w:val="Hyperlink"/>
+          </w:rPr>
+          <w:t>https://globetrender.com/</w:t>
+        </w:r>
+        <w:r>
+          <w:rPr>
+            <w:rStyle w:val="Hyperlink"/>
+          </w:rPr>
+          <w:t>2</w:t>
+        </w:r>
+        <w:r>
+          <w:rPr>
+            <w:rStyle w:val="Hyperlink"/>
+          </w:rPr>
+          <w:t>022/02/09/app-in-the-air-personal-assistant-frequent-flyers/</w:t>
+        </w:r>
+      </w:hyperlink>
+      <w:r>
+        <w:t xml:space="preserve"> (quote and founding info)</w:t>
+      </w:r>
+    </w:p>
+    <w:p>
+      <w:hyperlink r:id="rId15" w:history="1">
+        <w:r>
+          <w:rPr>
+            <w:rStyle w:val="Hyperlink"/>
+          </w:rPr>
+          <w:t>https://www.pointhacks.com.au/app-in-the-air-guide/</w:t>
+        </w:r>
+      </w:hyperlink>
+      <w:r>
+        <w:t xml:space="preserve"> (Feature list)</w:t>
+      </w:r>
+    </w:p>
+    <w:p>
+      <w:hyperlink r:id="rId16" w:history="1">
+        <w:r>
+          <w:rPr>
+            <w:rStyle w:val="Hyperlink"/>
+          </w:rPr>
+          <w:t>https://techround.co.uk/interviews/interview-with-bayram-annakov-founder-ceo-at-app-in-the-air/</w:t>
+        </w:r>
+      </w:hyperlink>
+    </w:p>
+    <w:p>
+      <w:hyperlink r:id="rId17" w:history="1">
+        <w:r>
+          <w:rPr>
+            <w:rStyle w:val="Hyperlink"/>
+          </w:rPr>
+          <w:t>https://aviationweek.com/air-transport/airports-networks/community-spotlight-app-air</w:t>
+        </w:r>
+      </w:hyperlink>
+      <w:r>
+        <w:t xml:space="preserve"> (target audience, AI)</w:t>
+      </w:r>
+    </w:p>
+    <w:p>
+      <w:hyperlink r:id="rId18" w:history="1">
+        <w:r>
+          <w:rPr>
+            <w:rStyle w:val="Hyperlink"/>
+          </w:rPr>
+          <w:t>https://worldtraveller73.com/2024/09/26/app-in-the-air-shuts-down-what-users-need-to-know/</w:t>
+        </w:r>
+      </w:hyperlink>
+    </w:p>
+    <w:p/>
+    <w:p/>
     <w:p>
       <w:pPr>
         <w:pStyle w:val="Heading3"/>
       </w:pPr>
-      <w:r>
-        <w:t xml:space="preserve"> </w:t>
-      </w:r>
-      <w:r>
-        <w:t xml:space="preserve">  </w:t>
-      </w:r>
-      <w:r>
-        <w:rPr>
-          <w:i/>
-          <w:iCs/>
-        </w:rPr>
-        <w:t xml:space="preserve"> </w:t>
-      </w:r>
       <w:r>
         <w:rPr>
           <w:i/>
@@ -5147,7 +5522,7 @@
         </w:rPr>
         <w:t xml:space="preserve">AWC Data API documentation: </w:t>
       </w:r>
-      <w:hyperlink r:id="rId13" w:history="1">
+      <w:hyperlink r:id="rId19" w:history="1">
         <w:r>
           <w:rPr>
             <w:rStyle w:val="Hyperlink"/>
@@ -5401,7 +5776,7 @@
         </w:rPr>
         <w:t xml:space="preserve">Met Eireann Open Data documentation: </w:t>
       </w:r>
-      <w:hyperlink r:id="rId14" w:history="1">
+      <w:hyperlink r:id="rId20" w:history="1">
         <w:r>
           <w:rPr>
             <w:rStyle w:val="Hyperlink"/>
@@ -6811,9 +7186,9 @@
       </w:r>
     </w:p>
     <w:sectPr>
-      <w:headerReference w:type="default" r:id="rId15"/>
-      <w:footerReference w:type="even" r:id="rId16"/>
-      <w:footerReference w:type="default" r:id="rId17"/>
+      <w:headerReference w:type="default" r:id="rId21"/>
+      <w:footerReference w:type="even" r:id="rId22"/>
+      <w:footerReference w:type="default" r:id="rId23"/>
       <w:pgSz w:w="11906" w:h="16838"/>
       <w:pgMar w:top="1440" w:right="1134" w:bottom="1440" w:left="1134" w:header="709" w:footer="709" w:gutter="0"/>
       <w:cols w:space="708"/>

</xml_diff>